<commit_message>
Started cleaning up PM01
</commit_message>
<xml_diff>
--- a/PM 01/evidence/Ryan Ward PM-01.docx
+++ b/PM 01/evidence/Ryan Ward PM-01.docx
@@ -34,6 +34,773 @@
           <w:lang w:val="en-US"/>
         </w:rPr>
         <w:t>structions</w:t>
+      </w:r>
+    </w:p>
+    <w:p>
+      <w:pPr>
+        <w:rPr>
+          <w:lang w:val="en-US"/>
+        </w:rPr>
+      </w:pPr>
+      <w:r>
+        <w:rPr>
+          <w:noProof/>
+        </w:rPr>
+        <w:drawing>
+          <wp:inline distT="0" distB="0" distL="0" distR="0" wp14:anchorId="40D0E5D7" wp14:editId="09E6095C">
+            <wp:extent cx="5731510" cy="349250"/>
+            <wp:effectExtent l="0" t="0" r="2540" b="0"/>
+            <wp:docPr id="1377371608" name="Picture 1"/>
+            <wp:cNvGraphicFramePr>
+              <a:graphicFrameLocks xmlns:a="http://schemas.openxmlformats.org/drawingml/2006/main" noChangeAspect="1"/>
+            </wp:cNvGraphicFramePr>
+            <a:graphic xmlns:a="http://schemas.openxmlformats.org/drawingml/2006/main">
+              <a:graphicData uri="http://schemas.openxmlformats.org/drawingml/2006/picture">
+                <pic:pic xmlns:pic="http://schemas.openxmlformats.org/drawingml/2006/picture">
+                  <pic:nvPicPr>
+                    <pic:cNvPr id="1377371608" name=""/>
+                    <pic:cNvPicPr/>
+                  </pic:nvPicPr>
+                  <pic:blipFill>
+                    <a:blip r:embed="rId4"/>
+                    <a:stretch>
+                      <a:fillRect/>
+                    </a:stretch>
+                  </pic:blipFill>
+                  <pic:spPr>
+                    <a:xfrm>
+                      <a:off x="0" y="0"/>
+                      <a:ext cx="5731510" cy="349250"/>
+                    </a:xfrm>
+                    <a:prstGeom prst="rect">
+                      <a:avLst/>
+                    </a:prstGeom>
+                  </pic:spPr>
+                </pic:pic>
+              </a:graphicData>
+            </a:graphic>
+          </wp:inline>
+        </w:drawing>
+      </w:r>
+    </w:p>
+    <w:p>
+      <w:pPr>
+        <w:rPr>
+          <w:lang w:val="en-US"/>
+        </w:rPr>
+      </w:pPr>
+      <w:r>
+        <w:rPr>
+          <w:noProof/>
+        </w:rPr>
+        <w:drawing>
+          <wp:inline distT="0" distB="0" distL="0" distR="0" wp14:anchorId="6AE7BBC5" wp14:editId="6BB90111">
+            <wp:extent cx="2952750" cy="1524000"/>
+            <wp:effectExtent l="0" t="0" r="0" b="0"/>
+            <wp:docPr id="249037208" name="Picture 1" descr="The image shows a screenshot of a text editor interface displaying various file names and extensions related to web development, such as 'index.html', 'README.md', and 'script.js'.&#10;&#10;AI-generated content may be incorrect."/>
+            <wp:cNvGraphicFramePr>
+              <a:graphicFrameLocks xmlns:a="http://schemas.openxmlformats.org/drawingml/2006/main" noChangeAspect="1"/>
+            </wp:cNvGraphicFramePr>
+            <a:graphic xmlns:a="http://schemas.openxmlformats.org/drawingml/2006/main">
+              <a:graphicData uri="http://schemas.openxmlformats.org/drawingml/2006/picture">
+                <pic:pic xmlns:pic="http://schemas.openxmlformats.org/drawingml/2006/picture">
+                  <pic:nvPicPr>
+                    <pic:cNvPr id="249037208" name="Picture 1" descr="The image shows a screenshot of a text editor interface displaying various file names and extensions related to web development, such as 'index.html', 'README.md', and 'script.js'.&#10;&#10;AI-generated content may be incorrect."/>
+                    <pic:cNvPicPr/>
+                  </pic:nvPicPr>
+                  <pic:blipFill>
+                    <a:blip r:embed="rId5"/>
+                    <a:stretch>
+                      <a:fillRect/>
+                    </a:stretch>
+                  </pic:blipFill>
+                  <pic:spPr>
+                    <a:xfrm>
+                      <a:off x="0" y="0"/>
+                      <a:ext cx="2952750" cy="1524000"/>
+                    </a:xfrm>
+                    <a:prstGeom prst="rect">
+                      <a:avLst/>
+                    </a:prstGeom>
+                  </pic:spPr>
+                </pic:pic>
+              </a:graphicData>
+            </a:graphic>
+          </wp:inline>
+        </w:drawing>
+      </w:r>
+    </w:p>
+    <w:p>
+      <w:pPr>
+        <w:pStyle w:val="Heading3"/>
+        <w:rPr>
+          <w:lang w:val="en-US"/>
+        </w:rPr>
+      </w:pPr>
+      <w:r>
+        <w:rPr>
+          <w:lang w:val="en-US"/>
+        </w:rPr>
+        <w:t>Activity</w:t>
+      </w:r>
+      <w:r>
+        <w:rPr>
+          <w:lang w:val="en-US"/>
+        </w:rPr>
+        <w:t xml:space="preserve"> 1 Checkpoint</w:t>
+      </w:r>
+    </w:p>
+    <w:p>
+      <w:pPr>
+        <w:pStyle w:val="Heading4"/>
+        <w:rPr>
+          <w:lang w:val="en-US"/>
+        </w:rPr>
+      </w:pPr>
+      <w:r>
+        <w:rPr>
+          <w:lang w:val="en-US"/>
+        </w:rPr>
+        <w:t>Can you explain what a project</w:t>
+      </w:r>
+      <w:r>
+        <w:rPr>
+          <w:lang w:val="en-US"/>
+        </w:rPr>
+        <w:t xml:space="preserve"> folder is?</w:t>
+      </w:r>
+    </w:p>
+    <w:p>
+      <w:r>
+        <w:t>Yes, the project folder is what holds all the files</w:t>
+      </w:r>
+      <w:r>
+        <w:t xml:space="preserve"> inside. Allowing it to be accessed easily and will not get mistaking somewhere else.</w:t>
+      </w:r>
+    </w:p>
+    <w:p>
+      <w:pPr>
+        <w:pStyle w:val="Heading4"/>
+        <w:rPr>
+          <w:lang w:val="en-US"/>
+        </w:rPr>
+      </w:pPr>
+      <w:r>
+        <w:rPr>
+          <w:lang w:val="en-US"/>
+        </w:rPr>
+        <w:t>Can you identify index.html</w:t>
+      </w:r>
+      <w:r>
+        <w:rPr>
+          <w:lang w:val="en-US"/>
+        </w:rPr>
+        <w:t>, style.css and script.js?</w:t>
+      </w:r>
+    </w:p>
+    <w:p>
+      <w:pPr>
+        <w:rPr>
+          <w:lang w:val="en-US"/>
+        </w:rPr>
+      </w:pPr>
+      <w:r>
+        <w:rPr>
+          <w:lang w:val="en-US"/>
+        </w:rPr>
+        <w:t xml:space="preserve">Yes, the index.html is the body of the webpage, the </w:t>
+      </w:r>
+      <w:r>
+        <w:rPr>
+          <w:lang w:val="en-US"/>
+        </w:rPr>
+        <w:t xml:space="preserve">style.css file gives the webpage styles and </w:t>
+      </w:r>
+      <w:proofErr w:type="spellStart"/>
+      <w:r>
+        <w:rPr>
+          <w:lang w:val="en-US"/>
+        </w:rPr>
+        <w:t>colour</w:t>
+      </w:r>
+      <w:proofErr w:type="spellEnd"/>
+      <w:r>
+        <w:rPr>
+          <w:lang w:val="en-US"/>
+        </w:rPr>
+        <w:t xml:space="preserve"> and the script.js gives the webpage behavior.</w:t>
+      </w:r>
+    </w:p>
+    <w:p>
+      <w:pPr>
+        <w:pStyle w:val="Heading4"/>
+        <w:rPr>
+          <w:lang w:val="en-US"/>
+        </w:rPr>
+      </w:pPr>
+      <w:r>
+        <w:rPr>
+          <w:lang w:val="en-US"/>
+        </w:rPr>
+        <w:t>Why should related</w:t>
+      </w:r>
+      <w:r>
+        <w:rPr>
+          <w:lang w:val="en-US"/>
+        </w:rPr>
+        <w:t xml:space="preserve"> project files stay together?</w:t>
+      </w:r>
+    </w:p>
+    <w:p>
+      <w:pPr>
+        <w:rPr>
+          <w:lang w:val="en-US"/>
+        </w:rPr>
+      </w:pPr>
+      <w:r>
+        <w:rPr>
+          <w:lang w:val="en-US"/>
+        </w:rPr>
+        <w:t xml:space="preserve">So that the file can be accessed more easily and can not be mistaking somewhere else </w:t>
+      </w:r>
+      <w:r>
+        <w:rPr>
+          <w:lang w:val="en-US"/>
+        </w:rPr>
+        <w:t>in another program.</w:t>
+      </w:r>
+    </w:p>
+    <w:p>
+      <w:pPr>
+        <w:pStyle w:val="Heading4"/>
+        <w:rPr>
+          <w:lang w:val="en-US"/>
+        </w:rPr>
+      </w:pPr>
+      <w:r>
+        <w:rPr>
+          <w:lang w:val="en-US"/>
+        </w:rPr>
+        <w:t>What problem could happen if a file name is typed incorrectly?</w:t>
+      </w:r>
+    </w:p>
+    <w:p>
+      <w:pPr>
+        <w:rPr>
+          <w:lang w:val="en-US"/>
+        </w:rPr>
+      </w:pPr>
+      <w:r>
+        <w:rPr>
+          <w:lang w:val="en-US"/>
+        </w:rPr>
+        <w:t xml:space="preserve">If the file name is spelled </w:t>
+      </w:r>
+      <w:r>
+        <w:rPr>
+          <w:lang w:val="en-US"/>
+        </w:rPr>
+        <w:t>incorrectly,</w:t>
+      </w:r>
+      <w:r>
+        <w:rPr>
+          <w:lang w:val="en-US"/>
+        </w:rPr>
+        <w:t xml:space="preserve"> it will not </w:t>
+      </w:r>
+      <w:r>
+        <w:rPr>
+          <w:lang w:val="en-US"/>
+        </w:rPr>
+        <w:t xml:space="preserve">be picked up in the index </w:t>
+      </w:r>
+      <w:r>
+        <w:rPr>
+          <w:lang w:val="en-US"/>
+        </w:rPr>
+        <w:t>making styles or behavior not to work.</w:t>
+      </w:r>
+    </w:p>
+    <w:p>
+      <w:pPr>
+        <w:pStyle w:val="Heading2"/>
+        <w:rPr>
+          <w:lang w:val="en-US"/>
+        </w:rPr>
+      </w:pPr>
+      <w:r>
+        <w:rPr>
+          <w:lang w:val="en-US"/>
+        </w:rPr>
+        <w:t xml:space="preserve">Activity </w:t>
+      </w:r>
+      <w:r>
+        <w:rPr>
+          <w:lang w:val="en-US"/>
+        </w:rPr>
+        <w:t>2: Build the HTML Structure</w:t>
+      </w:r>
+    </w:p>
+    <w:p>
+      <w:pPr>
+        <w:pStyle w:val="Heading3"/>
+        <w:rPr>
+          <w:lang w:val="en-US"/>
+        </w:rPr>
+      </w:pPr>
+      <w:r>
+        <w:rPr>
+          <w:lang w:val="en-US"/>
+        </w:rPr>
+        <w:t xml:space="preserve"> Starter HTML Template</w:t>
+      </w:r>
+    </w:p>
+    <w:p>
+      <w:pPr>
+        <w:rPr>
+          <w:lang w:val="en-US"/>
+        </w:rPr>
+      </w:pPr>
+      <w:r>
+        <w:rPr>
+          <w:noProof/>
+        </w:rPr>
+        <w:drawing>
+          <wp:inline distT="0" distB="0" distL="0" distR="0" wp14:anchorId="2B0A3875" wp14:editId="783217A6">
+            <wp:extent cx="5731510" cy="3481070"/>
+            <wp:effectExtent l="0" t="0" r="2540" b="5080"/>
+            <wp:docPr id="565700237" name="Picture 1" descr="The image displays a simple HTML file with embedded JavaScript, featuring a welcome message, a button, and a reference to external CSS and JavaScript files.&#10;&#10;AI-generated content may be incorrect."/>
+            <wp:cNvGraphicFramePr>
+              <a:graphicFrameLocks xmlns:a="http://schemas.openxmlformats.org/drawingml/2006/main" noChangeAspect="1"/>
+            </wp:cNvGraphicFramePr>
+            <a:graphic xmlns:a="http://schemas.openxmlformats.org/drawingml/2006/main">
+              <a:graphicData uri="http://schemas.openxmlformats.org/drawingml/2006/picture">
+                <pic:pic xmlns:pic="http://schemas.openxmlformats.org/drawingml/2006/picture">
+                  <pic:nvPicPr>
+                    <pic:cNvPr id="565700237" name="Picture 1" descr="The image displays a simple HTML file with embedded JavaScript, featuring a welcome message, a button, and a reference to external CSS and JavaScript files.&#10;&#10;AI-generated content may be incorrect."/>
+                    <pic:cNvPicPr/>
+                  </pic:nvPicPr>
+                  <pic:blipFill>
+                    <a:blip r:embed="rId6"/>
+                    <a:stretch>
+                      <a:fillRect/>
+                    </a:stretch>
+                  </pic:blipFill>
+                  <pic:spPr>
+                    <a:xfrm>
+                      <a:off x="0" y="0"/>
+                      <a:ext cx="5731510" cy="3481070"/>
+                    </a:xfrm>
+                    <a:prstGeom prst="rect">
+                      <a:avLst/>
+                    </a:prstGeom>
+                  </pic:spPr>
+                </pic:pic>
+              </a:graphicData>
+            </a:graphic>
+          </wp:inline>
+        </w:drawing>
+      </w:r>
+    </w:p>
+    <w:p>
+      <w:pPr>
+        <w:pStyle w:val="Heading3"/>
+        <w:rPr>
+          <w:lang w:val="en-US"/>
+        </w:rPr>
+      </w:pPr>
+      <w:r>
+        <w:rPr>
+          <w:lang w:val="en-US"/>
+        </w:rPr>
+        <w:t>Activity 2 Checkpoint</w:t>
+      </w:r>
+    </w:p>
+    <w:p>
+      <w:pPr>
+        <w:pStyle w:val="Heading4"/>
+        <w:rPr>
+          <w:lang w:val="en-US"/>
+        </w:rPr>
+      </w:pPr>
+      <w:r>
+        <w:rPr>
+          <w:lang w:val="en-US"/>
+        </w:rPr>
+        <w:t xml:space="preserve">What does HTML do </w:t>
+      </w:r>
+      <w:proofErr w:type="gramStart"/>
+      <w:r>
+        <w:rPr>
+          <w:lang w:val="en-US"/>
+        </w:rPr>
+        <w:t>in</w:t>
+      </w:r>
+      <w:proofErr w:type="gramEnd"/>
+      <w:r>
+        <w:rPr>
+          <w:lang w:val="en-US"/>
+        </w:rPr>
+        <w:t xml:space="preserve"> a web page?</w:t>
+      </w:r>
+    </w:p>
+    <w:p>
+      <w:pPr>
+        <w:rPr>
+          <w:lang w:val="en-US"/>
+        </w:rPr>
+      </w:pPr>
+      <w:r>
+        <w:rPr>
+          <w:lang w:val="en-US"/>
+        </w:rPr>
+        <w:t xml:space="preserve">HTML acts as the body of the web page, allowing the user </w:t>
+      </w:r>
+      <w:r>
+        <w:rPr>
+          <w:lang w:val="en-US"/>
+        </w:rPr>
+        <w:t xml:space="preserve">to </w:t>
+      </w:r>
+      <w:r>
+        <w:rPr>
+          <w:lang w:val="en-US"/>
+        </w:rPr>
+        <w:t xml:space="preserve">see </w:t>
+      </w:r>
+      <w:r>
+        <w:rPr>
+          <w:lang w:val="en-US"/>
+        </w:rPr>
+        <w:t xml:space="preserve">what </w:t>
+      </w:r>
+      <w:r>
+        <w:rPr>
+          <w:lang w:val="en-US"/>
+        </w:rPr>
+        <w:t>they have typed in their index file.</w:t>
+      </w:r>
+    </w:p>
+    <w:p>
+      <w:pPr>
+        <w:pStyle w:val="Heading4"/>
+        <w:rPr>
+          <w:lang w:val="en-US"/>
+        </w:rPr>
+      </w:pPr>
+      <w:r>
+        <w:rPr>
+          <w:lang w:val="en-US"/>
+        </w:rPr>
+        <w:t>Which line connects the CSS file?</w:t>
+      </w:r>
+    </w:p>
+    <w:p>
+      <w:pPr>
+        <w:rPr>
+          <w:lang w:val="en-US"/>
+        </w:rPr>
+      </w:pPr>
+      <w:r>
+        <w:rPr>
+          <w:lang w:val="en-US"/>
+        </w:rPr>
+        <w:t xml:space="preserve">In screenshot in Activity 2 checkpoint, that will be line </w:t>
+      </w:r>
+      <w:r>
+        <w:rPr>
+          <w:lang w:val="en-US"/>
+        </w:rPr>
+        <w:t>7.</w:t>
+      </w:r>
+    </w:p>
+    <w:p>
+      <w:pPr>
+        <w:pStyle w:val="Heading4"/>
+        <w:rPr>
+          <w:lang w:val="en-US"/>
+        </w:rPr>
+      </w:pPr>
+      <w:r>
+        <w:rPr>
+          <w:lang w:val="en-US"/>
+        </w:rPr>
+        <w:t xml:space="preserve">Which line </w:t>
+      </w:r>
+      <w:r>
+        <w:rPr>
+          <w:lang w:val="en-US"/>
+        </w:rPr>
+        <w:t>connects the JavaScript file?</w:t>
+      </w:r>
+    </w:p>
+    <w:p>
+      <w:pPr>
+        <w:rPr>
+          <w:lang w:val="en-US"/>
+        </w:rPr>
+      </w:pPr>
+      <w:r>
+        <w:rPr>
+          <w:lang w:val="en-US"/>
+        </w:rPr>
+        <w:t xml:space="preserve">In screenshot in Activity 2 checkpoint, that will be line </w:t>
+      </w:r>
+      <w:r>
+        <w:rPr>
+          <w:lang w:val="en-US"/>
+        </w:rPr>
+        <w:t>21</w:t>
+      </w:r>
+      <w:r>
+        <w:rPr>
+          <w:lang w:val="en-US"/>
+        </w:rPr>
+        <w:t>.</w:t>
+      </w:r>
+    </w:p>
+    <w:p>
+      <w:pPr>
+        <w:pStyle w:val="Heading4"/>
+        <w:rPr>
+          <w:lang w:val="en-US"/>
+        </w:rPr>
+      </w:pPr>
+      <w:r>
+        <w:rPr>
+          <w:lang w:val="en-US"/>
+        </w:rPr>
+        <w:t xml:space="preserve">Why is the button </w:t>
+      </w:r>
+      <w:r>
+        <w:rPr>
+          <w:lang w:val="en-US"/>
+        </w:rPr>
+        <w:t>important in this activity?</w:t>
+      </w:r>
+    </w:p>
+    <w:p>
+      <w:pPr>
+        <w:rPr>
+          <w:lang w:val="en-US"/>
+        </w:rPr>
+      </w:pPr>
+      <w:r>
+        <w:rPr>
+          <w:lang w:val="en-US"/>
+        </w:rPr>
+        <w:t xml:space="preserve">The button is important as it allows for user interaction on the webpage and can be used later to add style and behavior. </w:t>
+      </w:r>
+    </w:p>
+    <w:p>
+      <w:pPr>
+        <w:pStyle w:val="Heading4"/>
+        <w:rPr>
+          <w:lang w:val="en-US"/>
+        </w:rPr>
+      </w:pPr>
+      <w:r>
+        <w:rPr>
+          <w:lang w:val="en-US"/>
+        </w:rPr>
+        <w:t xml:space="preserve">What will </w:t>
+      </w:r>
+      <w:r>
+        <w:rPr>
+          <w:lang w:val="en-US"/>
+        </w:rPr>
+        <w:t>happen if script.js is mis</w:t>
+      </w:r>
+      <w:r>
+        <w:rPr>
+          <w:lang w:val="en-US"/>
+        </w:rPr>
+        <w:t>spelled?</w:t>
+      </w:r>
+    </w:p>
+    <w:p>
+      <w:pPr>
+        <w:rPr>
+          <w:lang w:val="en-US"/>
+        </w:rPr>
+      </w:pPr>
+      <w:r>
+        <w:rPr>
+          <w:lang w:val="en-US"/>
+        </w:rPr>
+        <w:t xml:space="preserve">If the file is misspelled it will not run </w:t>
+      </w:r>
+      <w:r>
+        <w:rPr>
+          <w:lang w:val="en-US"/>
+        </w:rPr>
+        <w:t>any of</w:t>
+      </w:r>
+      <w:r>
+        <w:rPr>
+          <w:lang w:val="en-US"/>
+        </w:rPr>
+        <w:t xml:space="preserve"> the functions and behavior put into the file as the index will be looking for something completely different.</w:t>
+      </w:r>
+    </w:p>
+    <w:p>
+      <w:pPr>
+        <w:pStyle w:val="Heading2"/>
+        <w:rPr>
+          <w:lang w:val="en-US"/>
+        </w:rPr>
+      </w:pPr>
+      <w:r>
+        <w:rPr>
+          <w:lang w:val="en-US"/>
+        </w:rPr>
+        <w:t xml:space="preserve">Activity </w:t>
+      </w:r>
+      <w:r>
+        <w:rPr>
+          <w:lang w:val="en-US"/>
+        </w:rPr>
+        <w:t>3: Add Basic CSS Styling</w:t>
+      </w:r>
+    </w:p>
+    <w:p>
+      <w:pPr>
+        <w:pStyle w:val="Heading3"/>
+        <w:rPr>
+          <w:lang w:val="en-US"/>
+        </w:rPr>
+      </w:pPr>
+      <w:r>
+        <w:rPr>
+          <w:lang w:val="en-US"/>
+        </w:rPr>
+        <w:t>Starter CSS</w:t>
+      </w:r>
+    </w:p>
+    <w:p>
+      <w:pPr>
+        <w:pStyle w:val="Heading3"/>
+        <w:rPr>
+          <w:lang w:val="en-US"/>
+        </w:rPr>
+      </w:pPr>
+      <w:r>
+        <w:rPr>
+          <w:lang w:val="en-US"/>
+        </w:rPr>
+        <w:t xml:space="preserve">Activity </w:t>
+      </w:r>
+      <w:r>
+        <w:rPr>
+          <w:lang w:val="en-US"/>
+        </w:rPr>
+        <w:t>3 Checkpoint</w:t>
+      </w:r>
+    </w:p>
+    <w:p>
+      <w:pPr>
+        <w:pStyle w:val="Heading4"/>
+        <w:rPr>
+          <w:lang w:val="en-US"/>
+        </w:rPr>
+      </w:pPr>
+      <w:r>
+        <w:rPr>
+          <w:lang w:val="en-US"/>
+        </w:rPr>
+        <w:t xml:space="preserve">What does CSS do </w:t>
+      </w:r>
+      <w:proofErr w:type="gramStart"/>
+      <w:r>
+        <w:rPr>
+          <w:lang w:val="en-US"/>
+        </w:rPr>
+        <w:t>in</w:t>
+      </w:r>
+      <w:proofErr w:type="gramEnd"/>
+      <w:r>
+        <w:rPr>
+          <w:lang w:val="en-US"/>
+        </w:rPr>
+        <w:t xml:space="preserve"> a web page?</w:t>
+      </w:r>
+    </w:p>
+    <w:p>
+      <w:pPr>
+        <w:pStyle w:val="Heading4"/>
+        <w:rPr>
+          <w:lang w:val="en-US"/>
+        </w:rPr>
+      </w:pPr>
+      <w:r>
+        <w:rPr>
+          <w:lang w:val="en-US"/>
+        </w:rPr>
+        <w:t xml:space="preserve">What </w:t>
+      </w:r>
+      <w:r>
+        <w:rPr>
+          <w:lang w:val="en-US"/>
+        </w:rPr>
+        <w:t>is the difference between margin and padding?</w:t>
+      </w:r>
+    </w:p>
+    <w:p>
+      <w:pPr>
+        <w:pStyle w:val="Heading4"/>
+        <w:rPr>
+          <w:lang w:val="en-US"/>
+        </w:rPr>
+      </w:pPr>
+      <w:r>
+        <w:rPr>
+          <w:lang w:val="en-US"/>
+        </w:rPr>
+        <w:t xml:space="preserve">What does </w:t>
+      </w:r>
+      <w:proofErr w:type="spellStart"/>
+      <w:proofErr w:type="gramStart"/>
+      <w:r>
+        <w:rPr>
+          <w:lang w:val="en-US"/>
+        </w:rPr>
+        <w:t>button:hover</w:t>
+      </w:r>
+      <w:proofErr w:type="spellEnd"/>
+      <w:proofErr w:type="gramEnd"/>
+      <w:r>
+        <w:rPr>
+          <w:lang w:val="en-US"/>
+        </w:rPr>
+        <w:t xml:space="preserve"> mean?</w:t>
+      </w:r>
+    </w:p>
+    <w:p>
+      <w:pPr>
+        <w:pStyle w:val="Heading4"/>
+        <w:rPr>
+          <w:lang w:val="en-US"/>
+        </w:rPr>
+      </w:pPr>
+      <w:r>
+        <w:rPr>
+          <w:lang w:val="en-US"/>
+        </w:rPr>
+        <w:t>Why is consistent styling useful in workplace systems?</w:t>
+      </w:r>
+    </w:p>
+    <w:p>
+      <w:pPr>
+        <w:pStyle w:val="Heading4"/>
+        <w:rPr>
+          <w:lang w:val="en-US"/>
+        </w:rPr>
+      </w:pPr>
+      <w:r>
+        <w:rPr>
+          <w:lang w:val="en-US"/>
+        </w:rPr>
+        <w:t>How can you safely experiment with styling?</w:t>
       </w:r>
     </w:p>
     <w:p>
@@ -525,7 +1292,6 @@
     <w:next w:val="Normal"/>
     <w:link w:val="Heading4Char"/>
     <w:uiPriority w:val="9"/>
-    <w:semiHidden/>
     <w:unhideWhenUsed/>
     <w:qFormat/>
     <w:rsid w:val="00136CEF"/>
@@ -722,7 +1488,6 @@
     <w:basedOn w:val="DefaultParagraphFont"/>
     <w:link w:val="Heading4"/>
     <w:uiPriority w:val="9"/>
-    <w:semiHidden/>
     <w:rsid w:val="00136CEF"/>
     <w:rPr>
       <w:rFonts w:eastAsiaTheme="majorEastAsia" w:cstheme="majorBidi"/>

</xml_diff>

<commit_message>
Continued to complete PM01
</commit_message>
<xml_diff>
--- a/PM 01/evidence/Ryan Ward PM-01.docx
+++ b/PM 01/evidence/Ryan Ward PM-01.docx
@@ -977,6 +977,100 @@
     </w:p>
     <w:p>
       <w:pPr>
+        <w:rPr>
+          <w:lang w:val="en-US"/>
+        </w:rPr>
+      </w:pPr>
+      <w:r>
+        <w:rPr>
+          <w:noProof/>
+        </w:rPr>
+        <w:drawing>
+          <wp:inline distT="0" distB="0" distL="0" distR="0" wp14:anchorId="289B0EF8" wp14:editId="74DF353E">
+            <wp:extent cx="5731510" cy="1306830"/>
+            <wp:effectExtent l="0" t="0" r="2540" b="7620"/>
+            <wp:docPr id="160184873" name="Picture 1" descr="The image depicts a segment of a JavaScript code snippet with an alert message welcoming users to JavaScript Fundamentals, followed by a console log statement indicating successful loading of the script.&#10;&#10;AI-generated content may be incorrect."/>
+            <wp:cNvGraphicFramePr>
+              <a:graphicFrameLocks xmlns:a="http://schemas.openxmlformats.org/drawingml/2006/main" noChangeAspect="1"/>
+            </wp:cNvGraphicFramePr>
+            <a:graphic xmlns:a="http://schemas.openxmlformats.org/drawingml/2006/main">
+              <a:graphicData uri="http://schemas.openxmlformats.org/drawingml/2006/picture">
+                <pic:pic xmlns:pic="http://schemas.openxmlformats.org/drawingml/2006/picture">
+                  <pic:nvPicPr>
+                    <pic:cNvPr id="160184873" name="Picture 1" descr="The image depicts a segment of a JavaScript code snippet with an alert message welcoming users to JavaScript Fundamentals, followed by a console log statement indicating successful loading of the script.&#10;&#10;AI-generated content may be incorrect."/>
+                    <pic:cNvPicPr/>
+                  </pic:nvPicPr>
+                  <pic:blipFill>
+                    <a:blip r:embed="rId8"/>
+                    <a:stretch>
+                      <a:fillRect/>
+                    </a:stretch>
+                  </pic:blipFill>
+                  <pic:spPr>
+                    <a:xfrm>
+                      <a:off x="0" y="0"/>
+                      <a:ext cx="5731510" cy="1306830"/>
+                    </a:xfrm>
+                    <a:prstGeom prst="rect">
+                      <a:avLst/>
+                    </a:prstGeom>
+                  </pic:spPr>
+                </pic:pic>
+              </a:graphicData>
+            </a:graphic>
+          </wp:inline>
+        </w:drawing>
+      </w:r>
+    </w:p>
+    <w:p>
+      <w:pPr>
+        <w:rPr>
+          <w:lang w:val="en-US"/>
+        </w:rPr>
+      </w:pPr>
+      <w:r>
+        <w:rPr>
+          <w:noProof/>
+        </w:rPr>
+        <w:drawing>
+          <wp:inline distT="0" distB="0" distL="0" distR="0" wp14:anchorId="3CD0313D" wp14:editId="61D959B2">
+            <wp:extent cx="5731510" cy="889000"/>
+            <wp:effectExtent l="0" t="0" r="2540" b="6350"/>
+            <wp:docPr id="879983969" name="Picture 1" descr="Welcome to JavaScript Fundamentals!&#10;&#10;AI-generated content may be incorrect."/>
+            <wp:cNvGraphicFramePr>
+              <a:graphicFrameLocks xmlns:a="http://schemas.openxmlformats.org/drawingml/2006/main" noChangeAspect="1"/>
+            </wp:cNvGraphicFramePr>
+            <a:graphic xmlns:a="http://schemas.openxmlformats.org/drawingml/2006/main">
+              <a:graphicData uri="http://schemas.openxmlformats.org/drawingml/2006/picture">
+                <pic:pic xmlns:pic="http://schemas.openxmlformats.org/drawingml/2006/picture">
+                  <pic:nvPicPr>
+                    <pic:cNvPr id="879983969" name="Picture 1" descr="Welcome to JavaScript Fundamentals!&#10;&#10;AI-generated content may be incorrect."/>
+                    <pic:cNvPicPr/>
+                  </pic:nvPicPr>
+                  <pic:blipFill>
+                    <a:blip r:embed="rId9"/>
+                    <a:stretch>
+                      <a:fillRect/>
+                    </a:stretch>
+                  </pic:blipFill>
+                  <pic:spPr>
+                    <a:xfrm>
+                      <a:off x="0" y="0"/>
+                      <a:ext cx="5731510" cy="889000"/>
+                    </a:xfrm>
+                    <a:prstGeom prst="rect">
+                      <a:avLst/>
+                    </a:prstGeom>
+                  </pic:spPr>
+                </pic:pic>
+              </a:graphicData>
+            </a:graphic>
+          </wp:inline>
+        </w:drawing>
+      </w:r>
+    </w:p>
+    <w:p>
+      <w:pPr>
         <w:pStyle w:val="Heading3"/>
         <w:rPr>
           <w:lang w:val="en-US"/>
@@ -997,129 +1091,377 @@
     </w:p>
     <w:p>
       <w:pPr>
+        <w:rPr>
+          <w:lang w:val="en-US"/>
+        </w:rPr>
+      </w:pPr>
+      <w:r>
+        <w:rPr>
+          <w:noProof/>
+        </w:rPr>
+        <w:drawing>
+          <wp:inline distT="0" distB="0" distL="0" distR="0" wp14:anchorId="4BECE6E6" wp14:editId="4646777E">
+            <wp:extent cx="5731510" cy="1323975"/>
+            <wp:effectExtent l="0" t="0" r="2540" b="9525"/>
+            <wp:docPr id="622175044" name="Picture 1" descr="The provided text is a snippet of JavaScript code, which includes the creation of a button element and an event listener that triggers an alert message when the button is clicked, as well as a console log statement.&#10;&#10;AI-generated content may be incorrect."/>
+            <wp:cNvGraphicFramePr>
+              <a:graphicFrameLocks xmlns:a="http://schemas.openxmlformats.org/drawingml/2006/main" noChangeAspect="1"/>
+            </wp:cNvGraphicFramePr>
+            <a:graphic xmlns:a="http://schemas.openxmlformats.org/drawingml/2006/main">
+              <a:graphicData uri="http://schemas.openxmlformats.org/drawingml/2006/picture">
+                <pic:pic xmlns:pic="http://schemas.openxmlformats.org/drawingml/2006/picture">
+                  <pic:nvPicPr>
+                    <pic:cNvPr id="622175044" name="Picture 1" descr="The provided text is a snippet of JavaScript code, which includes the creation of a button element and an event listener that triggers an alert message when the button is clicked, as well as a console log statement.&#10;&#10;AI-generated content may be incorrect."/>
+                    <pic:cNvPicPr/>
+                  </pic:nvPicPr>
+                  <pic:blipFill>
+                    <a:blip r:embed="rId10"/>
+                    <a:stretch>
+                      <a:fillRect/>
+                    </a:stretch>
+                  </pic:blipFill>
+                  <pic:spPr>
+                    <a:xfrm>
+                      <a:off x="0" y="0"/>
+                      <a:ext cx="5731510" cy="1323975"/>
+                    </a:xfrm>
+                    <a:prstGeom prst="rect">
+                      <a:avLst/>
+                    </a:prstGeom>
+                  </pic:spPr>
+                </pic:pic>
+              </a:graphicData>
+            </a:graphic>
+          </wp:inline>
+        </w:drawing>
+      </w:r>
+    </w:p>
+    <w:p>
+      <w:pPr>
+        <w:rPr>
+          <w:lang w:val="en-US"/>
+        </w:rPr>
+      </w:pPr>
+      <w:r>
+        <w:rPr>
+          <w:noProof/>
+        </w:rPr>
+        <w:drawing>
+          <wp:inline distT="0" distB="0" distL="0" distR="0" wp14:anchorId="5FFDF1EE" wp14:editId="24DFB65C">
+            <wp:extent cx="5731510" cy="1858010"/>
+            <wp:effectExtent l="0" t="0" r="2540" b="8890"/>
+            <wp:docPr id="986218652" name="Picture 1" descr="The image displays a webpage interface with a welcome message, a congratulatory JavaScript button, and sections for learning JavaScript fundamentals.&#10;&#10;AI-generated content may be incorrect."/>
+            <wp:cNvGraphicFramePr>
+              <a:graphicFrameLocks xmlns:a="http://schemas.openxmlformats.org/drawingml/2006/main" noChangeAspect="1"/>
+            </wp:cNvGraphicFramePr>
+            <a:graphic xmlns:a="http://schemas.openxmlformats.org/drawingml/2006/main">
+              <a:graphicData uri="http://schemas.openxmlformats.org/drawingml/2006/picture">
+                <pic:pic xmlns:pic="http://schemas.openxmlformats.org/drawingml/2006/picture">
+                  <pic:nvPicPr>
+                    <pic:cNvPr id="986218652" name="Picture 1" descr="The image displays a webpage interface with a welcome message, a congratulatory JavaScript button, and sections for learning JavaScript fundamentals.&#10;&#10;AI-generated content may be incorrect."/>
+                    <pic:cNvPicPr/>
+                  </pic:nvPicPr>
+                  <pic:blipFill>
+                    <a:blip r:embed="rId11"/>
+                    <a:stretch>
+                      <a:fillRect/>
+                    </a:stretch>
+                  </pic:blipFill>
+                  <pic:spPr>
+                    <a:xfrm>
+                      <a:off x="0" y="0"/>
+                      <a:ext cx="5731510" cy="1858010"/>
+                    </a:xfrm>
+                    <a:prstGeom prst="rect">
+                      <a:avLst/>
+                    </a:prstGeom>
+                  </pic:spPr>
+                </pic:pic>
+              </a:graphicData>
+            </a:graphic>
+          </wp:inline>
+        </w:drawing>
+      </w:r>
+      <w:r>
+        <w:rPr>
+          <w:noProof/>
+        </w:rPr>
+        <w:drawing>
+          <wp:inline distT="0" distB="0" distL="0" distR="0" wp14:anchorId="6C56C0FD" wp14:editId="60AE1D88">
+            <wp:extent cx="5257800" cy="1704975"/>
+            <wp:effectExtent l="0" t="0" r="0" b="9525"/>
+            <wp:docPr id="107150217" name="Picture 1" descr="The image depicts a webpage with a console interface displaying various elements such as elements, sources, network performance, and error messages related to unrecognized keys, followed by a script execution and a user interaction with a welcome button.&#10;&#10;AI-generated content may be incorrect."/>
+            <wp:cNvGraphicFramePr>
+              <a:graphicFrameLocks xmlns:a="http://schemas.openxmlformats.org/drawingml/2006/main" noChangeAspect="1"/>
+            </wp:cNvGraphicFramePr>
+            <a:graphic xmlns:a="http://schemas.openxmlformats.org/drawingml/2006/main">
+              <a:graphicData uri="http://schemas.openxmlformats.org/drawingml/2006/picture">
+                <pic:pic xmlns:pic="http://schemas.openxmlformats.org/drawingml/2006/picture">
+                  <pic:nvPicPr>
+                    <pic:cNvPr id="107150217" name="Picture 1" descr="The image depicts a webpage with a console interface displaying various elements such as elements, sources, network performance, and error messages related to unrecognized keys, followed by a script execution and a user interaction with a welcome button.&#10;&#10;AI-generated content may be incorrect."/>
+                    <pic:cNvPicPr/>
+                  </pic:nvPicPr>
+                  <pic:blipFill>
+                    <a:blip r:embed="rId12"/>
+                    <a:stretch>
+                      <a:fillRect/>
+                    </a:stretch>
+                  </pic:blipFill>
+                  <pic:spPr>
+                    <a:xfrm>
+                      <a:off x="0" y="0"/>
+                      <a:ext cx="5257800" cy="1704975"/>
+                    </a:xfrm>
+                    <a:prstGeom prst="rect">
+                      <a:avLst/>
+                    </a:prstGeom>
+                  </pic:spPr>
+                </pic:pic>
+              </a:graphicData>
+            </a:graphic>
+          </wp:inline>
+        </w:drawing>
+      </w:r>
+    </w:p>
+    <w:p>
+      <w:pPr>
         <w:pStyle w:val="Heading3"/>
-        <w:rPr>
-          <w:lang w:val="en-US"/>
-        </w:rPr>
-      </w:pPr>
+      </w:pPr>
+      <w:r>
+        <w:t xml:space="preserve">Optional </w:t>
+      </w:r>
+      <w:proofErr w:type="gramStart"/>
+      <w:r>
+        <w:t>Extension :</w:t>
+      </w:r>
+      <w:proofErr w:type="gramEnd"/>
+      <w:r>
+        <w:t xml:space="preserve"> Charge Page Text on Click</w:t>
+      </w:r>
+    </w:p>
+    <w:p>
+      <w:r>
+        <w:rPr>
+          <w:noProof/>
+        </w:rPr>
+        <w:drawing>
+          <wp:inline distT="0" distB="0" distL="0" distR="0" wp14:anchorId="6534E85E" wp14:editId="20DD8B54">
+            <wp:extent cx="5731510" cy="1992630"/>
+            <wp:effectExtent l="0" t="0" r="2540" b="7620"/>
+            <wp:docPr id="427452907" name="Picture 1" descr="welcomeButton&#10;&#10;AI-generated content may be incorrect."/>
+            <wp:cNvGraphicFramePr>
+              <a:graphicFrameLocks xmlns:a="http://schemas.openxmlformats.org/drawingml/2006/main" noChangeAspect="1"/>
+            </wp:cNvGraphicFramePr>
+            <a:graphic xmlns:a="http://schemas.openxmlformats.org/drawingml/2006/main">
+              <a:graphicData uri="http://schemas.openxmlformats.org/drawingml/2006/picture">
+                <pic:pic xmlns:pic="http://schemas.openxmlformats.org/drawingml/2006/picture">
+                  <pic:nvPicPr>
+                    <pic:cNvPr id="427452907" name="Picture 1" descr="welcomeButton&#10;&#10;AI-generated content may be incorrect."/>
+                    <pic:cNvPicPr/>
+                  </pic:nvPicPr>
+                  <pic:blipFill>
+                    <a:blip r:embed="rId13"/>
+                    <a:stretch>
+                      <a:fillRect/>
+                    </a:stretch>
+                  </pic:blipFill>
+                  <pic:spPr>
+                    <a:xfrm>
+                      <a:off x="0" y="0"/>
+                      <a:ext cx="5731510" cy="1992630"/>
+                    </a:xfrm>
+                    <a:prstGeom prst="rect">
+                      <a:avLst/>
+                    </a:prstGeom>
+                  </pic:spPr>
+                </pic:pic>
+              </a:graphicData>
+            </a:graphic>
+          </wp:inline>
+        </w:drawing>
+      </w:r>
+      <w:r>
+        <w:rPr>
+          <w:noProof/>
+        </w:rPr>
+        <w:drawing>
+          <wp:inline distT="0" distB="0" distL="0" distR="0" wp14:anchorId="60BA0E78" wp14:editId="22B60EBA">
+            <wp:extent cx="5731510" cy="1720215"/>
+            <wp:effectExtent l="0" t="0" r="2540" b="0"/>
+            <wp:docPr id="873776614" name="Picture 1" descr="JavaScript changed this message on the page.&#10;&#10;AI-generated content may be incorrect."/>
+            <wp:cNvGraphicFramePr>
+              <a:graphicFrameLocks xmlns:a="http://schemas.openxmlformats.org/drawingml/2006/main" noChangeAspect="1"/>
+            </wp:cNvGraphicFramePr>
+            <a:graphic xmlns:a="http://schemas.openxmlformats.org/drawingml/2006/main">
+              <a:graphicData uri="http://schemas.openxmlformats.org/drawingml/2006/picture">
+                <pic:pic xmlns:pic="http://schemas.openxmlformats.org/drawingml/2006/picture">
+                  <pic:nvPicPr>
+                    <pic:cNvPr id="873776614" name="Picture 1" descr="JavaScript changed this message on the page.&#10;&#10;AI-generated content may be incorrect."/>
+                    <pic:cNvPicPr/>
+                  </pic:nvPicPr>
+                  <pic:blipFill>
+                    <a:blip r:embed="rId14"/>
+                    <a:stretch>
+                      <a:fillRect/>
+                    </a:stretch>
+                  </pic:blipFill>
+                  <pic:spPr>
+                    <a:xfrm>
+                      <a:off x="0" y="0"/>
+                      <a:ext cx="5731510" cy="1720215"/>
+                    </a:xfrm>
+                    <a:prstGeom prst="rect">
+                      <a:avLst/>
+                    </a:prstGeom>
+                  </pic:spPr>
+                </pic:pic>
+              </a:graphicData>
+            </a:graphic>
+          </wp:inline>
+        </w:drawing>
+      </w:r>
+    </w:p>
+    <w:p>
+      <w:r>
+        <w:rPr>
+          <w:noProof/>
+        </w:rPr>
+        <w:drawing>
+          <wp:inline distT="0" distB="0" distL="0" distR="0" wp14:anchorId="3202A6EF" wp14:editId="478DE208">
+            <wp:extent cx="5731510" cy="2574290"/>
+            <wp:effectExtent l="0" t="0" r="2540" b="0"/>
+            <wp:docPr id="1480669688" name="Picture 1" descr="The image is a webpage with a welcoming message, a personal introduction, and a button for updating the message, showcasing the use of HTML, CSS, and JavaScript.&#10;&#10;AI-generated content may be incorrect."/>
+            <wp:cNvGraphicFramePr>
+              <a:graphicFrameLocks xmlns:a="http://schemas.openxmlformats.org/drawingml/2006/main" noChangeAspect="1"/>
+            </wp:cNvGraphicFramePr>
+            <a:graphic xmlns:a="http://schemas.openxmlformats.org/drawingml/2006/main">
+              <a:graphicData uri="http://schemas.openxmlformats.org/drawingml/2006/picture">
+                <pic:pic xmlns:pic="http://schemas.openxmlformats.org/drawingml/2006/picture">
+                  <pic:nvPicPr>
+                    <pic:cNvPr id="1480669688" name="Picture 1" descr="The image is a webpage with a welcoming message, a personal introduction, and a button for updating the message, showcasing the use of HTML, CSS, and JavaScript.&#10;&#10;AI-generated content may be incorrect."/>
+                    <pic:cNvPicPr/>
+                  </pic:nvPicPr>
+                  <pic:blipFill>
+                    <a:blip r:embed="rId15"/>
+                    <a:stretch>
+                      <a:fillRect/>
+                    </a:stretch>
+                  </pic:blipFill>
+                  <pic:spPr>
+                    <a:xfrm>
+                      <a:off x="0" y="0"/>
+                      <a:ext cx="5731510" cy="2574290"/>
+                    </a:xfrm>
+                    <a:prstGeom prst="rect">
+                      <a:avLst/>
+                    </a:prstGeom>
+                  </pic:spPr>
+                </pic:pic>
+              </a:graphicData>
+            </a:graphic>
+          </wp:inline>
+        </w:drawing>
+      </w:r>
+    </w:p>
+    <w:p>
+      <w:r>
+        <w:rPr>
+          <w:noProof/>
+        </w:rPr>
+        <w:drawing>
+          <wp:inline distT="0" distB="0" distL="0" distR="0" wp14:anchorId="4AC3CEB5" wp14:editId="2599D803">
+            <wp:extent cx="5731510" cy="1317625"/>
+            <wp:effectExtent l="0" t="0" r="2540" b="0"/>
+            <wp:docPr id="1439762718" name="Picture 1" descr="The image depicts a web page interface with a message welcoming a user named Ryan and an option to enable code suggestions.&#10;&#10;AI-generated content may be incorrect."/>
+            <wp:cNvGraphicFramePr>
+              <a:graphicFrameLocks xmlns:a="http://schemas.openxmlformats.org/drawingml/2006/main" noChangeAspect="1"/>
+            </wp:cNvGraphicFramePr>
+            <a:graphic xmlns:a="http://schemas.openxmlformats.org/drawingml/2006/main">
+              <a:graphicData uri="http://schemas.openxmlformats.org/drawingml/2006/picture">
+                <pic:pic xmlns:pic="http://schemas.openxmlformats.org/drawingml/2006/picture">
+                  <pic:nvPicPr>
+                    <pic:cNvPr id="1439762718" name="Picture 1" descr="The image depicts a web page interface with a message welcoming a user named Ryan and an option to enable code suggestions.&#10;&#10;AI-generated content may be incorrect."/>
+                    <pic:cNvPicPr/>
+                  </pic:nvPicPr>
+                  <pic:blipFill>
+                    <a:blip r:embed="rId16"/>
+                    <a:stretch>
+                      <a:fillRect/>
+                    </a:stretch>
+                  </pic:blipFill>
+                  <pic:spPr>
+                    <a:xfrm>
+                      <a:off x="0" y="0"/>
+                      <a:ext cx="5731510" cy="1317625"/>
+                    </a:xfrm>
+                    <a:prstGeom prst="rect">
+                      <a:avLst/>
+                    </a:prstGeom>
+                  </pic:spPr>
+                </pic:pic>
+              </a:graphicData>
+            </a:graphic>
+          </wp:inline>
+        </w:drawing>
+      </w:r>
+    </w:p>
+    <w:p>
+      <w:pPr>
+        <w:pStyle w:val="Heading3"/>
+      </w:pPr>
+      <w:r>
+        <w:t xml:space="preserve">Activity 4 </w:t>
+      </w:r>
+      <w:r>
+        <w:t>Checkpoint</w:t>
+      </w:r>
+    </w:p>
+    <w:p>
+      <w:pPr>
+        <w:pStyle w:val="Heading4"/>
+      </w:pPr>
+      <w:r>
+        <w:t>What does JavaScript add t</w:t>
+      </w:r>
+      <w:r>
+        <w:t>o the page?</w:t>
+      </w:r>
+    </w:p>
+    <w:p>
       <w:proofErr w:type="spellStart"/>
       <w:r>
-        <w:rPr>
-          <w:lang w:val="en-US"/>
-        </w:rPr>
-        <w:t>Work</w:t>
-      </w:r>
-      <w:r>
-        <w:rPr>
-          <w:lang w:val="en-US"/>
-        </w:rPr>
-        <w:t>Place</w:t>
+        <w:t>Javascript</w:t>
       </w:r>
       <w:proofErr w:type="spellEnd"/>
       <w:r>
-        <w:rPr>
-          <w:lang w:val="en-US"/>
-        </w:rPr>
-        <w:t xml:space="preserve"> Example:</w:t>
-      </w:r>
-      <w:r>
-        <w:rPr>
-          <w:lang w:val="en-US"/>
-        </w:rPr>
-        <w:t xml:space="preserve"> S</w:t>
-      </w:r>
-      <w:r>
-        <w:rPr>
-          <w:lang w:val="en-US"/>
-        </w:rPr>
-        <w:t>upport Welcome Message:</w:t>
-      </w:r>
-    </w:p>
-    <w:p>
-      <w:pPr>
-        <w:pStyle w:val="Heading3"/>
-        <w:rPr>
-          <w:lang w:val="fr-FR"/>
-        </w:rPr>
-      </w:pPr>
-      <w:proofErr w:type="spellStart"/>
-      <w:r>
-        <w:rPr>
-          <w:lang w:val="fr-FR"/>
-        </w:rPr>
-        <w:t>Optional</w:t>
-      </w:r>
-      <w:proofErr w:type="spellEnd"/>
-      <w:r>
-        <w:rPr>
-          <w:lang w:val="fr-FR"/>
-        </w:rPr>
-        <w:t xml:space="preserve"> </w:t>
-      </w:r>
-      <w:r>
-        <w:rPr>
-          <w:lang w:val="fr-FR"/>
-        </w:rPr>
-        <w:t>Extension :</w:t>
-      </w:r>
-      <w:r>
-        <w:rPr>
-          <w:lang w:val="fr-FR"/>
-        </w:rPr>
-        <w:t xml:space="preserve"> Charge Page </w:t>
-      </w:r>
-      <w:proofErr w:type="spellStart"/>
-      <w:r>
-        <w:rPr>
-          <w:lang w:val="fr-FR"/>
-        </w:rPr>
-        <w:t>T</w:t>
-      </w:r>
-      <w:r>
-        <w:rPr>
-          <w:lang w:val="fr-FR"/>
-        </w:rPr>
-        <w:t>ext</w:t>
-      </w:r>
-      <w:proofErr w:type="spellEnd"/>
-      <w:r>
-        <w:rPr>
-          <w:lang w:val="fr-FR"/>
-        </w:rPr>
-        <w:t xml:space="preserve"> on Click</w:t>
-      </w:r>
-    </w:p>
-    <w:p>
-      <w:pPr>
-        <w:pStyle w:val="Heading3"/>
-        <w:rPr>
-          <w:lang w:val="fr-FR"/>
-        </w:rPr>
-      </w:pPr>
-      <w:r>
-        <w:rPr>
-          <w:lang w:val="fr-FR"/>
-        </w:rPr>
-        <w:t xml:space="preserve">Activity 4 </w:t>
-      </w:r>
-      <w:proofErr w:type="spellStart"/>
-      <w:r>
-        <w:rPr>
-          <w:lang w:val="fr-FR"/>
-        </w:rPr>
-        <w:t>CheckPoint</w:t>
-      </w:r>
-      <w:proofErr w:type="spellEnd"/>
+        <w:t xml:space="preserve"> helps to give the page behaviour and functionality</w:t>
+      </w:r>
+      <w:r>
+        <w:t>. It can be used to add message when the button is clicked and to write a message to the browser console.</w:t>
+      </w:r>
     </w:p>
     <w:p>
       <w:pPr>
         <w:pStyle w:val="Heading4"/>
       </w:pPr>
       <w:r>
-        <w:t>What does JavaScript add t</w:t>
-      </w:r>
-      <w:r>
-        <w:t>o the page?</w:t>
+        <w:t xml:space="preserve">What is the purpose </w:t>
+      </w:r>
+      <w:r>
+        <w:t xml:space="preserve">of </w:t>
+      </w:r>
+      <w:proofErr w:type="gramStart"/>
+      <w:r>
+        <w:t>alert(</w:t>
+      </w:r>
+      <w:proofErr w:type="gramEnd"/>
+      <w:r>
+        <w:t>)?</w:t>
+      </w:r>
+    </w:p>
+    <w:p>
+      <w:r>
+        <w:t>It is to show a popup message in the browser.</w:t>
       </w:r>
     </w:p>
     <w:p>
@@ -1127,14 +1469,11 @@
         <w:pStyle w:val="Heading4"/>
       </w:pPr>
       <w:r>
-        <w:t xml:space="preserve">What is the purpose </w:t>
-      </w:r>
-      <w:r>
-        <w:t xml:space="preserve">of </w:t>
+        <w:t xml:space="preserve">What is the purpose of </w:t>
       </w:r>
       <w:proofErr w:type="gramStart"/>
       <w:r>
-        <w:t>alert(</w:t>
+        <w:t>console.log(</w:t>
       </w:r>
       <w:proofErr w:type="gramEnd"/>
       <w:r>
@@ -1142,19 +1481,13 @@
       </w:r>
     </w:p>
     <w:p>
-      <w:pPr>
-        <w:pStyle w:val="Heading4"/>
-      </w:pPr>
-      <w:r>
-        <w:t xml:space="preserve">What is the purpose of </w:t>
-      </w:r>
       <w:proofErr w:type="gramStart"/>
       <w:r>
-        <w:t>console.log(</w:t>
+        <w:t>It’s</w:t>
       </w:r>
       <w:proofErr w:type="gramEnd"/>
       <w:r>
-        <w:t>)?</w:t>
+        <w:t xml:space="preserve"> purpose is to write a test/debug message in the console.</w:t>
       </w:r>
     </w:p>
     <w:p>
@@ -1167,7 +1500,13 @@
       <w:proofErr w:type="spellStart"/>
       <w:proofErr w:type="gramStart"/>
       <w:r>
-        <w:t>getElementBtId</w:t>
+        <w:t>getElementB</w:t>
+      </w:r>
+      <w:r>
+        <w:t>y</w:t>
+      </w:r>
+      <w:r>
+        <w:t>Id</w:t>
       </w:r>
       <w:proofErr w:type="spellEnd"/>
       <w:r>
@@ -1179,6 +1518,14 @@
       </w:r>
     </w:p>
     <w:p>
+      <w:r>
+        <w:t xml:space="preserve">It helps to find </w:t>
+      </w:r>
+      <w:r>
+        <w:t>the HTML element with that ID.</w:t>
+      </w:r>
+    </w:p>
+    <w:p>
       <w:pPr>
         <w:pStyle w:val="Heading4"/>
       </w:pPr>
@@ -1203,7 +1550,73 @@
         <w:t>learning interactivity?</w:t>
       </w:r>
     </w:p>
-    <w:p/>
+    <w:p>
+      <w:r>
+        <w:t>A button can be used to write a message to the browser console</w:t>
+      </w:r>
+      <w:r>
+        <w:t xml:space="preserve"> which will introduce the idea that JavaScript can respond to user actions.</w:t>
+      </w:r>
+    </w:p>
+    <w:p>
+      <w:pPr>
+        <w:pStyle w:val="Heading2"/>
+      </w:pPr>
+      <w:r>
+        <w:t xml:space="preserve">Activity </w:t>
+      </w:r>
+      <w:r>
+        <w:t>5: Run the Project in the Browser</w:t>
+      </w:r>
+    </w:p>
+    <w:p>
+      <w:pPr>
+        <w:pStyle w:val="Heading3"/>
+      </w:pPr>
+      <w:r>
+        <w:t>How to Open the Page</w:t>
+      </w:r>
+    </w:p>
+    <w:p>
+      <w:pPr>
+        <w:pStyle w:val="Heading3"/>
+      </w:pPr>
+      <w:r>
+        <w:t>Activity 5: Checkpoint:</w:t>
+      </w:r>
+    </w:p>
+    <w:p>
+      <w:pPr>
+        <w:pStyle w:val="Heading4"/>
+      </w:pPr>
+      <w:r>
+        <w:t>Why should code be tested in the browser?</w:t>
+      </w:r>
+    </w:p>
+    <w:p>
+      <w:pPr>
+        <w:pStyle w:val="Heading4"/>
+      </w:pPr>
+      <w:r>
+        <w:t>What should learners do after editing code?</w:t>
+      </w:r>
+    </w:p>
+    <w:p>
+      <w:pPr>
+        <w:pStyle w:val="Heading4"/>
+      </w:pPr>
+      <w:r>
+        <w:t>How can learners confirm that JavaScript is running?</w:t>
+      </w:r>
+    </w:p>
+    <w:p>
+      <w:pPr>
+        <w:pStyle w:val="Heading4"/>
+      </w:pPr>
+      <w:r>
+        <w:t>What should learners check if styling does not appear?</w:t>
+      </w:r>
+    </w:p>
     <w:sectPr>
       <w:pgSz w:w="11906" w:h="16838"/>
       <w:pgMar w:top="1440" w:right="1440" w:bottom="1440" w:left="1440" w:header="708" w:footer="708" w:gutter="0"/>

</xml_diff>

<commit_message>
Added final part for PM01
</commit_message>
<xml_diff>
--- a/PM 01/evidence/Ryan Ward PM-01.docx
+++ b/PM 01/evidence/Ryan Ward PM-01.docx
@@ -27,7 +27,7 @@
         <w:rPr>
           <w:lang w:val="en-US"/>
         </w:rPr>
-        <w:t>3.2 Step-by-Step In</w:t>
+        <w:t>Step-by-Step In</w:t>
       </w:r>
       <w:r>
         <w:rPr>
@@ -1578,6 +1578,132 @@
       </w:r>
     </w:p>
     <w:p>
+      <w:r>
+        <w:rPr>
+          <w:noProof/>
+        </w:rPr>
+        <w:drawing>
+          <wp:inline distT="0" distB="0" distL="0" distR="0" wp14:anchorId="50D13D90" wp14:editId="0B60B3A0">
+            <wp:extent cx="5731510" cy="2322830"/>
+            <wp:effectExtent l="0" t="0" r="2540" b="1270"/>
+            <wp:docPr id="512371897" name="Picture 1" descr="Welcome to JavaScript Fundamentals!&#10;&#10;AI-generated content may be incorrect."/>
+            <wp:cNvGraphicFramePr>
+              <a:graphicFrameLocks xmlns:a="http://schemas.openxmlformats.org/drawingml/2006/main" noChangeAspect="1"/>
+            </wp:cNvGraphicFramePr>
+            <a:graphic xmlns:a="http://schemas.openxmlformats.org/drawingml/2006/main">
+              <a:graphicData uri="http://schemas.openxmlformats.org/drawingml/2006/picture">
+                <pic:pic xmlns:pic="http://schemas.openxmlformats.org/drawingml/2006/picture">
+                  <pic:nvPicPr>
+                    <pic:cNvPr id="512371897" name="Picture 1" descr="Welcome to JavaScript Fundamentals!&#10;&#10;AI-generated content may be incorrect."/>
+                    <pic:cNvPicPr/>
+                  </pic:nvPicPr>
+                  <pic:blipFill>
+                    <a:blip r:embed="rId17"/>
+                    <a:stretch>
+                      <a:fillRect/>
+                    </a:stretch>
+                  </pic:blipFill>
+                  <pic:spPr>
+                    <a:xfrm>
+                      <a:off x="0" y="0"/>
+                      <a:ext cx="5731510" cy="2322830"/>
+                    </a:xfrm>
+                    <a:prstGeom prst="rect">
+                      <a:avLst/>
+                    </a:prstGeom>
+                  </pic:spPr>
+                </pic:pic>
+              </a:graphicData>
+            </a:graphic>
+          </wp:inline>
+        </w:drawing>
+      </w:r>
+    </w:p>
+    <w:p>
+      <w:r>
+        <w:rPr>
+          <w:noProof/>
+        </w:rPr>
+        <w:drawing>
+          <wp:inline distT="0" distB="0" distL="0" distR="0" wp14:anchorId="38E82C5B" wp14:editId="65DC3DCB">
+            <wp:extent cx="5731510" cy="2843530"/>
+            <wp:effectExtent l="0" t="0" r="2540" b="0"/>
+            <wp:docPr id="16348927" name="Picture 1" descr="The image is a web page with a welcoming message, a personal introduction, and a button to update the message, featuring HTML, CSS, and JavaScript.&#10;&#10;AI-generated content may be incorrect."/>
+            <wp:cNvGraphicFramePr>
+              <a:graphicFrameLocks xmlns:a="http://schemas.openxmlformats.org/drawingml/2006/main" noChangeAspect="1"/>
+            </wp:cNvGraphicFramePr>
+            <a:graphic xmlns:a="http://schemas.openxmlformats.org/drawingml/2006/main">
+              <a:graphicData uri="http://schemas.openxmlformats.org/drawingml/2006/picture">
+                <pic:pic xmlns:pic="http://schemas.openxmlformats.org/drawingml/2006/picture">
+                  <pic:nvPicPr>
+                    <pic:cNvPr id="16348927" name="Picture 1" descr="The image is a web page with a welcoming message, a personal introduction, and a button to update the message, featuring HTML, CSS, and JavaScript.&#10;&#10;AI-generated content may be incorrect."/>
+                    <pic:cNvPicPr/>
+                  </pic:nvPicPr>
+                  <pic:blipFill>
+                    <a:blip r:embed="rId18"/>
+                    <a:stretch>
+                      <a:fillRect/>
+                    </a:stretch>
+                  </pic:blipFill>
+                  <pic:spPr>
+                    <a:xfrm>
+                      <a:off x="0" y="0"/>
+                      <a:ext cx="5731510" cy="2843530"/>
+                    </a:xfrm>
+                    <a:prstGeom prst="rect">
+                      <a:avLst/>
+                    </a:prstGeom>
+                  </pic:spPr>
+                </pic:pic>
+              </a:graphicData>
+            </a:graphic>
+          </wp:inline>
+        </w:drawing>
+      </w:r>
+    </w:p>
+    <w:p>
+      <w:r>
+        <w:rPr>
+          <w:noProof/>
+        </w:rPr>
+        <w:drawing>
+          <wp:inline distT="0" distB="0" distL="0" distR="0" wp14:anchorId="3487BDBE" wp14:editId="6A522763">
+            <wp:extent cx="5731510" cy="3103245"/>
+            <wp:effectExtent l="0" t="0" r="2540" b="1905"/>
+            <wp:docPr id="1309982156" name="Picture 1" descr="Well done! You clicked the JavaScript button,&#10;&#10;AI-generated content may be incorrect."/>
+            <wp:cNvGraphicFramePr>
+              <a:graphicFrameLocks xmlns:a="http://schemas.openxmlformats.org/drawingml/2006/main" noChangeAspect="1"/>
+            </wp:cNvGraphicFramePr>
+            <a:graphic xmlns:a="http://schemas.openxmlformats.org/drawingml/2006/main">
+              <a:graphicData uri="http://schemas.openxmlformats.org/drawingml/2006/picture">
+                <pic:pic xmlns:pic="http://schemas.openxmlformats.org/drawingml/2006/picture">
+                  <pic:nvPicPr>
+                    <pic:cNvPr id="1309982156" name="Picture 1" descr="Well done! You clicked the JavaScript button,&#10;&#10;AI-generated content may be incorrect."/>
+                    <pic:cNvPicPr/>
+                  </pic:nvPicPr>
+                  <pic:blipFill>
+                    <a:blip r:embed="rId19"/>
+                    <a:stretch>
+                      <a:fillRect/>
+                    </a:stretch>
+                  </pic:blipFill>
+                  <pic:spPr>
+                    <a:xfrm>
+                      <a:off x="0" y="0"/>
+                      <a:ext cx="5731510" cy="3103245"/>
+                    </a:xfrm>
+                    <a:prstGeom prst="rect">
+                      <a:avLst/>
+                    </a:prstGeom>
+                  </pic:spPr>
+                </pic:pic>
+              </a:graphicData>
+            </a:graphic>
+          </wp:inline>
+        </w:drawing>
+      </w:r>
+    </w:p>
+    <w:p>
       <w:pPr>
         <w:pStyle w:val="Heading3"/>
       </w:pPr>
@@ -1594,6 +1720,23 @@
       </w:r>
     </w:p>
     <w:p>
+      <w:r>
+        <w:t xml:space="preserve">It needs to be </w:t>
+      </w:r>
+      <w:r>
+        <w:t>in the browser because the browser is the environment that reads HTML, applies C</w:t>
+      </w:r>
+      <w:r>
+        <w:t>SS and runs Java</w:t>
+      </w:r>
+      <w:r>
+        <w:t>Script</w:t>
+      </w:r>
+      <w:r>
+        <w:t>.</w:t>
+      </w:r>
+    </w:p>
+    <w:p>
       <w:pPr>
         <w:pStyle w:val="Heading4"/>
       </w:pPr>
@@ -1602,6 +1745,20 @@
       </w:r>
     </w:p>
     <w:p>
+      <w:r>
+        <w:t xml:space="preserve">After editing code, learners </w:t>
+      </w:r>
+      <w:r>
+        <w:t>must save</w:t>
+      </w:r>
+      <w:r>
+        <w:t xml:space="preserve"> the file and refresh </w:t>
+      </w:r>
+      <w:r>
+        <w:t>the browser.</w:t>
+      </w:r>
+    </w:p>
+    <w:p>
       <w:pPr>
         <w:pStyle w:val="Heading4"/>
       </w:pPr>
@@ -1610,6 +1767,22 @@
       </w:r>
     </w:p>
     <w:p>
+      <w:r>
+        <w:t xml:space="preserve">If the user put in </w:t>
+      </w:r>
+      <w:proofErr w:type="gramStart"/>
+      <w:r>
+        <w:t>console.log</w:t>
+      </w:r>
+      <w:r>
+        <w:t>(</w:t>
+      </w:r>
+      <w:proofErr w:type="gramEnd"/>
+      <w:r>
+        <w:t>) in their JavaScript they will receive pop messages and error messages in the console field.</w:t>
+      </w:r>
+    </w:p>
+    <w:p>
       <w:pPr>
         <w:pStyle w:val="Heading4"/>
       </w:pPr>
@@ -1617,6 +1790,468 @@
         <w:t>What should learners check if styling does not appear?</w:t>
       </w:r>
     </w:p>
+    <w:p>
+      <w:r>
+        <w:t xml:space="preserve">The learner should </w:t>
+      </w:r>
+      <w:r>
+        <w:t xml:space="preserve">check if spelling of the file </w:t>
+      </w:r>
+      <w:r>
+        <w:t xml:space="preserve">is correct </w:t>
+      </w:r>
+      <w:r>
+        <w:t xml:space="preserve">and check if semi-columns show at the end of </w:t>
+      </w:r>
+      <w:r>
+        <w:t>each change.</w:t>
+      </w:r>
+    </w:p>
+    <w:p>
+      <w:pPr>
+        <w:pStyle w:val="Heading2"/>
+      </w:pPr>
+      <w:r>
+        <w:t>A</w:t>
+      </w:r>
+      <w:r>
+        <w:t>ctivity 6: Use Browser Developer Tools</w:t>
+      </w:r>
+    </w:p>
+    <w:p>
+      <w:pPr>
+        <w:pStyle w:val="Heading3"/>
+      </w:pPr>
+      <w:r>
+        <w:t>Opening Developer Tools</w:t>
+      </w:r>
+    </w:p>
+    <w:p>
+      <w:r>
+        <w:rPr>
+          <w:noProof/>
+        </w:rPr>
+        <w:drawing>
+          <wp:inline distT="0" distB="0" distL="0" distR="0" wp14:anchorId="71B3EC26" wp14:editId="058132E1">
+            <wp:extent cx="5731510" cy="1471930"/>
+            <wp:effectExtent l="0" t="0" r="2540" b="0"/>
+            <wp:docPr id="129845082" name="Picture 1" descr="The image depicts a web page with a red alert message, a JavaScript console, and a script.js file displaying a message and code suggestions.&#10;&#10;AI-generated content may be incorrect."/>
+            <wp:cNvGraphicFramePr>
+              <a:graphicFrameLocks xmlns:a="http://schemas.openxmlformats.org/drawingml/2006/main" noChangeAspect="1"/>
+            </wp:cNvGraphicFramePr>
+            <a:graphic xmlns:a="http://schemas.openxmlformats.org/drawingml/2006/main">
+              <a:graphicData uri="http://schemas.openxmlformats.org/drawingml/2006/picture">
+                <pic:pic xmlns:pic="http://schemas.openxmlformats.org/drawingml/2006/picture">
+                  <pic:nvPicPr>
+                    <pic:cNvPr id="129845082" name="Picture 1" descr="The image depicts a web page with a red alert message, a JavaScript console, and a script.js file displaying a message and code suggestions.&#10;&#10;AI-generated content may be incorrect."/>
+                    <pic:cNvPicPr/>
+                  </pic:nvPicPr>
+                  <pic:blipFill>
+                    <a:blip r:embed="rId20"/>
+                    <a:stretch>
+                      <a:fillRect/>
+                    </a:stretch>
+                  </pic:blipFill>
+                  <pic:spPr>
+                    <a:xfrm>
+                      <a:off x="0" y="0"/>
+                      <a:ext cx="5731510" cy="1471930"/>
+                    </a:xfrm>
+                    <a:prstGeom prst="rect">
+                      <a:avLst/>
+                    </a:prstGeom>
+                  </pic:spPr>
+                </pic:pic>
+              </a:graphicData>
+            </a:graphic>
+          </wp:inline>
+        </w:drawing>
+      </w:r>
+    </w:p>
+    <w:p>
+      <w:pPr>
+        <w:pStyle w:val="Heading3"/>
+      </w:pPr>
+      <w:r>
+        <w:t>Console Messages</w:t>
+      </w:r>
+    </w:p>
+    <w:p>
+      <w:r>
+        <w:rPr>
+          <w:noProof/>
+        </w:rPr>
+        <w:drawing>
+          <wp:inline distT="0" distB="0" distL="0" distR="0" wp14:anchorId="34D2A34F" wp14:editId="36E2CB29">
+            <wp:extent cx="5731510" cy="1689735"/>
+            <wp:effectExtent l="0" t="0" r="2540" b="5715"/>
+            <wp:docPr id="1851949126" name="Picture 1" descr="The provided text appears to be a snippet of JavaScript code that includes an event listener for a button click, which alerts the user, changes the content of a message element, and logs messages to the console.&#10;&#10;AI-generated content may be incorrect."/>
+            <wp:cNvGraphicFramePr>
+              <a:graphicFrameLocks xmlns:a="http://schemas.openxmlformats.org/drawingml/2006/main" noChangeAspect="1"/>
+            </wp:cNvGraphicFramePr>
+            <a:graphic xmlns:a="http://schemas.openxmlformats.org/drawingml/2006/main">
+              <a:graphicData uri="http://schemas.openxmlformats.org/drawingml/2006/picture">
+                <pic:pic xmlns:pic="http://schemas.openxmlformats.org/drawingml/2006/picture">
+                  <pic:nvPicPr>
+                    <pic:cNvPr id="1851949126" name="Picture 1" descr="The provided text appears to be a snippet of JavaScript code that includes an event listener for a button click, which alerts the user, changes the content of a message element, and logs messages to the console.&#10;&#10;AI-generated content may be incorrect."/>
+                    <pic:cNvPicPr/>
+                  </pic:nvPicPr>
+                  <pic:blipFill>
+                    <a:blip r:embed="rId21"/>
+                    <a:stretch>
+                      <a:fillRect/>
+                    </a:stretch>
+                  </pic:blipFill>
+                  <pic:spPr>
+                    <a:xfrm>
+                      <a:off x="0" y="0"/>
+                      <a:ext cx="5731510" cy="1689735"/>
+                    </a:xfrm>
+                    <a:prstGeom prst="rect">
+                      <a:avLst/>
+                    </a:prstGeom>
+                  </pic:spPr>
+                </pic:pic>
+              </a:graphicData>
+            </a:graphic>
+          </wp:inline>
+        </w:drawing>
+      </w:r>
+    </w:p>
+    <w:p>
+      <w:r>
+        <w:rPr>
+          <w:noProof/>
+        </w:rPr>
+        <w:drawing>
+          <wp:inline distT="0" distB="0" distL="0" distR="0" wp14:anchorId="1810B31B" wp14:editId="3AD22306">
+            <wp:extent cx="5731510" cy="2508250"/>
+            <wp:effectExtent l="0" t="0" r="2540" b="6350"/>
+            <wp:docPr id="1404614993" name="Picture 1" descr="Welcome to My Web Page&#10;&#10;AI-generated content may be incorrect."/>
+            <wp:cNvGraphicFramePr>
+              <a:graphicFrameLocks xmlns:a="http://schemas.openxmlformats.org/drawingml/2006/main" noChangeAspect="1"/>
+            </wp:cNvGraphicFramePr>
+            <a:graphic xmlns:a="http://schemas.openxmlformats.org/drawingml/2006/main">
+              <a:graphicData uri="http://schemas.openxmlformats.org/drawingml/2006/picture">
+                <pic:pic xmlns:pic="http://schemas.openxmlformats.org/drawingml/2006/picture">
+                  <pic:nvPicPr>
+                    <pic:cNvPr id="1404614993" name="Picture 1" descr="Welcome to My Web Page&#10;&#10;AI-generated content may be incorrect."/>
+                    <pic:cNvPicPr/>
+                  </pic:nvPicPr>
+                  <pic:blipFill>
+                    <a:blip r:embed="rId22"/>
+                    <a:stretch>
+                      <a:fillRect/>
+                    </a:stretch>
+                  </pic:blipFill>
+                  <pic:spPr>
+                    <a:xfrm>
+                      <a:off x="0" y="0"/>
+                      <a:ext cx="5731510" cy="2508250"/>
+                    </a:xfrm>
+                    <a:prstGeom prst="rect">
+                      <a:avLst/>
+                    </a:prstGeom>
+                  </pic:spPr>
+                </pic:pic>
+              </a:graphicData>
+            </a:graphic>
+          </wp:inline>
+        </w:drawing>
+      </w:r>
+    </w:p>
+    <w:p>
+      <w:pPr>
+        <w:pStyle w:val="Heading3"/>
+      </w:pPr>
+      <w:r>
+        <w:t>Activity 6 Checkpoint</w:t>
+      </w:r>
+    </w:p>
+    <w:p>
+      <w:pPr>
+        <w:pStyle w:val="Heading4"/>
+      </w:pPr>
+      <w:r>
+        <w:t>How do you open br</w:t>
+      </w:r>
+      <w:r>
+        <w:t>owser developer tools?</w:t>
+      </w:r>
+    </w:p>
+    <w:p>
+      <w:r>
+        <w:t xml:space="preserve">To </w:t>
+      </w:r>
+      <w:r>
+        <w:t>open</w:t>
+      </w:r>
+      <w:r>
+        <w:t xml:space="preserve"> the browser developer tool the user needs to press F</w:t>
+      </w:r>
+      <w:r>
+        <w:t>12.</w:t>
+      </w:r>
+    </w:p>
+    <w:p>
+      <w:pPr>
+        <w:pStyle w:val="Heading4"/>
+      </w:pPr>
+      <w:r>
+        <w:t xml:space="preserve">Where does </w:t>
+      </w:r>
+      <w:proofErr w:type="gramStart"/>
+      <w:r>
+        <w:t>console.log(</w:t>
+      </w:r>
+      <w:proofErr w:type="gramEnd"/>
+      <w:r>
+        <w:t>)</w:t>
+      </w:r>
+      <w:r>
+        <w:t xml:space="preserve"> output appear?</w:t>
+      </w:r>
+    </w:p>
+    <w:p>
+      <w:r>
+        <w:t xml:space="preserve">The </w:t>
+      </w:r>
+      <w:proofErr w:type="gramStart"/>
+      <w:r>
+        <w:t>console.log(</w:t>
+      </w:r>
+      <w:proofErr w:type="gramEnd"/>
+      <w:r>
+        <w:t xml:space="preserve">) output will appear in the browser developer tool in the </w:t>
+      </w:r>
+      <w:r>
+        <w:t>Console tab.</w:t>
+      </w:r>
+    </w:p>
+    <w:p>
+      <w:pPr>
+        <w:pStyle w:val="Heading4"/>
+      </w:pPr>
+      <w:r>
+        <w:t>What does a red console error usually mean?</w:t>
+      </w:r>
+    </w:p>
+    <w:p>
+      <w:r>
+        <w:t>That error usually means that there is something wrong with the JavaScript somewhere in the code.</w:t>
+      </w:r>
+    </w:p>
+    <w:p>
+      <w:pPr>
+        <w:pStyle w:val="Heading4"/>
+      </w:pPr>
+      <w:r>
+        <w:t>Why is Developer Tools useful for support teams</w:t>
+      </w:r>
+    </w:p>
+    <w:p>
+      <w:r>
+        <w:t xml:space="preserve">It helps the support </w:t>
+      </w:r>
+      <w:r>
+        <w:t>team as the Developer tool can show messages from the console.log and</w:t>
+      </w:r>
+      <w:r>
+        <w:t xml:space="preserve"> shows the JavaScript errors</w:t>
+      </w:r>
+      <w:r>
+        <w:t xml:space="preserve">. The tool also helps </w:t>
+      </w:r>
+      <w:r>
+        <w:t>developers inspect, test and trouble</w:t>
+      </w:r>
+      <w:r>
+        <w:t>shoot.</w:t>
+      </w:r>
+    </w:p>
+    <w:p>
+      <w:pPr>
+        <w:pStyle w:val="Heading4"/>
+      </w:pPr>
+      <w:r>
+        <w:t>What should you check if JavaScript cannot find a button?</w:t>
+      </w:r>
+    </w:p>
+    <w:p>
+      <w:r>
+        <w:t xml:space="preserve">Check if the spelling </w:t>
+      </w:r>
+      <w:r>
+        <w:t>is the same for the button on both the JavaScript and the HTML index.</w:t>
+      </w:r>
+    </w:p>
+    <w:p>
+      <w:pPr>
+        <w:pStyle w:val="Heading2"/>
+      </w:pPr>
+      <w:r>
+        <w:t>Activity 7: Understand Git GitHub in Practice</w:t>
+      </w:r>
+    </w:p>
+    <w:p>
+      <w:pPr>
+        <w:pStyle w:val="Heading3"/>
+      </w:pPr>
+      <w:r>
+        <w:t xml:space="preserve">Beginner Git </w:t>
+      </w:r>
+      <w:proofErr w:type="spellStart"/>
+      <w:r>
+        <w:t>WorkFlow</w:t>
+      </w:r>
+      <w:proofErr w:type="spellEnd"/>
+    </w:p>
+    <w:p>
+      <w:pPr>
+        <w:pStyle w:val="Heading3"/>
+      </w:pPr>
+      <w:r>
+        <w:t>Activity 7 Checkpoint</w:t>
+      </w:r>
+    </w:p>
+    <w:p>
+      <w:pPr>
+        <w:pStyle w:val="Heading4"/>
+      </w:pPr>
+      <w:r>
+        <w:t>What</w:t>
+      </w:r>
+      <w:r>
+        <w:t xml:space="preserve"> is the difference between Git and GitHub?</w:t>
+      </w:r>
+    </w:p>
+    <w:p>
+      <w:pPr>
+        <w:pStyle w:val="Heading4"/>
+      </w:pPr>
+      <w:r>
+        <w:t>What is a repo</w:t>
+      </w:r>
+      <w:r>
+        <w:t>sitory?</w:t>
+      </w:r>
+    </w:p>
+    <w:p>
+      <w:pPr>
+        <w:pStyle w:val="Heading4"/>
+      </w:pPr>
+      <w:r>
+        <w:t>What is a commit?</w:t>
+      </w:r>
+    </w:p>
+    <w:p>
+      <w:pPr>
+        <w:pStyle w:val="Heading4"/>
+      </w:pPr>
+      <w:r>
+        <w:t>Why are clear commit messages useful?</w:t>
+      </w:r>
+    </w:p>
+    <w:p>
+      <w:pPr>
+        <w:pStyle w:val="Heading4"/>
+      </w:pPr>
+      <w:r>
+        <w:t>Why</w:t>
+      </w:r>
+      <w:r>
+        <w:t xml:space="preserve"> should teams avoid emailing code files?</w:t>
+      </w:r>
+    </w:p>
+    <w:p>
+      <w:pPr>
+        <w:pStyle w:val="Heading2"/>
+      </w:pPr>
+      <w:r>
+        <w:t>Activity 8: Commit, Branch, Push and Pull Request</w:t>
+      </w:r>
+    </w:p>
+    <w:p>
+      <w:pPr>
+        <w:pStyle w:val="Heading3"/>
+      </w:pPr>
+      <w:r>
+        <w:t>Create the first Commit</w:t>
+      </w:r>
+    </w:p>
+    <w:p>
+      <w:pPr>
+        <w:pStyle w:val="Heading3"/>
+      </w:pPr>
+      <w:r>
+        <w:t>Create a Branch for a Small Change</w:t>
+      </w:r>
+    </w:p>
+    <w:p>
+      <w:pPr>
+        <w:pStyle w:val="Heading3"/>
+      </w:pPr>
+      <w:r>
+        <w:t>Make a Small Change on the Branch</w:t>
+      </w:r>
+    </w:p>
+    <w:p>
+      <w:pPr>
+        <w:pStyle w:val="Heading3"/>
+      </w:pPr>
+      <w:r>
+        <w:t>Push the Branch to GitHub</w:t>
+      </w:r>
+    </w:p>
+    <w:p>
+      <w:pPr>
+        <w:pStyle w:val="Heading3"/>
+      </w:pPr>
+      <w:r>
+        <w:t>Activity 8 Checkpoint</w:t>
+      </w:r>
+    </w:p>
+    <w:p>
+      <w:pPr>
+        <w:pStyle w:val="Heading4"/>
+      </w:pPr>
+      <w:r>
+        <w:t>What is a branch used for?</w:t>
+      </w:r>
+    </w:p>
+    <w:p>
+      <w:pPr>
+        <w:pStyle w:val="Heading4"/>
+      </w:pPr>
+      <w:r>
+        <w:t>What does push mean?</w:t>
+      </w:r>
+    </w:p>
+    <w:p>
+      <w:pPr>
+        <w:pStyle w:val="Heading4"/>
+      </w:pPr>
+      <w:r>
+        <w:t>What is a pull request?</w:t>
+      </w:r>
+    </w:p>
+    <w:p>
+      <w:pPr>
+        <w:pStyle w:val="Heading4"/>
+      </w:pPr>
+      <w:r>
+        <w:t>Why should a pull request include a short description?</w:t>
+      </w:r>
+    </w:p>
+    <w:p>
+      <w:pPr>
+        <w:pStyle w:val="Heading4"/>
+      </w:pPr>
+      <w:r>
+        <w:t>What evidence should prove that the change was tested?</w:t>
+      </w:r>
+    </w:p>
+    <w:p/>
     <w:sectPr>
       <w:pgSz w:w="11906" w:h="16838"/>
       <w:pgMar w:top="1440" w:right="1440" w:bottom="1440" w:left="1440" w:header="708" w:footer="708" w:gutter="0"/>

</xml_diff>

<commit_message>
Create First interactive web page
</commit_message>
<xml_diff>
--- a/PM 01/evidence/Ryan Ward PM-01.docx
+++ b/PM 01/evidence/Ryan Ward PM-01.docx
@@ -2177,6 +2177,48 @@
       </w:pPr>
       <w:r>
         <w:t>Create the first Commit</w:t>
+      </w:r>
+    </w:p>
+    <w:p>
+      <w:r>
+        <w:rPr>
+          <w:noProof/>
+        </w:rPr>
+        <w:drawing>
+          <wp:inline distT="0" distB="0" distL="0" distR="0" wp14:anchorId="4763E0FE" wp14:editId="0D1776CA">
+            <wp:extent cx="5067300" cy="1847850"/>
+            <wp:effectExtent l="0" t="0" r="0" b="0"/>
+            <wp:docPr id="1983908249" name="Picture 1" descr="The image shows a Git command line interface displaying a status report of a repository, indicating that the user is on the 'Folder_structure_clean_up' branch, which is up to date with the 'origin' branch, and there are modified files, specifically a Word document and a CSS file.&#10;&#10;AI-generated content may be incorrect."/>
+            <wp:cNvGraphicFramePr>
+              <a:graphicFrameLocks xmlns:a="http://schemas.openxmlformats.org/drawingml/2006/main" noChangeAspect="1"/>
+            </wp:cNvGraphicFramePr>
+            <a:graphic xmlns:a="http://schemas.openxmlformats.org/drawingml/2006/main">
+              <a:graphicData uri="http://schemas.openxmlformats.org/drawingml/2006/picture">
+                <pic:pic xmlns:pic="http://schemas.openxmlformats.org/drawingml/2006/picture">
+                  <pic:nvPicPr>
+                    <pic:cNvPr id="1983908249" name="Picture 1" descr="The image shows a Git command line interface displaying a status report of a repository, indicating that the user is on the 'Folder_structure_clean_up' branch, which is up to date with the 'origin' branch, and there are modified files, specifically a Word document and a CSS file.&#10;&#10;AI-generated content may be incorrect."/>
+                    <pic:cNvPicPr/>
+                  </pic:nvPicPr>
+                  <pic:blipFill>
+                    <a:blip r:embed="rId23"/>
+                    <a:stretch>
+                      <a:fillRect/>
+                    </a:stretch>
+                  </pic:blipFill>
+                  <pic:spPr>
+                    <a:xfrm>
+                      <a:off x="0" y="0"/>
+                      <a:ext cx="5067300" cy="1847850"/>
+                    </a:xfrm>
+                    <a:prstGeom prst="rect">
+                      <a:avLst/>
+                    </a:prstGeom>
+                  </pic:spPr>
+                </pic:pic>
+              </a:graphicData>
+            </a:graphic>
+          </wp:inline>
+        </w:drawing>
       </w:r>
     </w:p>
     <w:p>

</xml_diff>

<commit_message>
Evidence document completed for PM01 and README file updated as well.
</commit_message>
<xml_diff>
--- a/PM 01/evidence/Ryan Ward PM-01.docx
+++ b/PM 01/evidence/Ryan Ward PM-01.docx
@@ -2100,11 +2100,93 @@
       <w:r>
         <w:t xml:space="preserve">Beginner Git </w:t>
       </w:r>
-      <w:proofErr w:type="spellStart"/>
-      <w:r>
-        <w:t>WorkFlow</w:t>
-      </w:r>
-      <w:proofErr w:type="spellEnd"/>
+      <w:r>
+        <w:t>Workflow</w:t>
+      </w:r>
+    </w:p>
+    <w:p>
+      <w:r>
+        <w:rPr>
+          <w:noProof/>
+        </w:rPr>
+        <w:drawing>
+          <wp:inline distT="0" distB="0" distL="0" distR="0" wp14:anchorId="292726EB" wp14:editId="03D9F2C0">
+            <wp:extent cx="5731510" cy="2586990"/>
+            <wp:effectExtent l="0" t="0" r="2540" b="3810"/>
+            <wp:docPr id="1431876584" name="Picture 1" descr="The image displays a command line interface with a series of text outputs, indicating a Git repository initialization, status check, and commit of files for a new web page project.&#10;&#10;AI-generated content may be incorrect."/>
+            <wp:cNvGraphicFramePr>
+              <a:graphicFrameLocks xmlns:a="http://schemas.openxmlformats.org/drawingml/2006/main" noChangeAspect="1"/>
+            </wp:cNvGraphicFramePr>
+            <a:graphic xmlns:a="http://schemas.openxmlformats.org/drawingml/2006/main">
+              <a:graphicData uri="http://schemas.openxmlformats.org/drawingml/2006/picture">
+                <pic:pic xmlns:pic="http://schemas.openxmlformats.org/drawingml/2006/picture">
+                  <pic:nvPicPr>
+                    <pic:cNvPr id="1431876584" name="Picture 1" descr="The image displays a command line interface with a series of text outputs, indicating a Git repository initialization, status check, and commit of files for a new web page project.&#10;&#10;AI-generated content may be incorrect."/>
+                    <pic:cNvPicPr/>
+                  </pic:nvPicPr>
+                  <pic:blipFill>
+                    <a:blip r:embed="rId23"/>
+                    <a:stretch>
+                      <a:fillRect/>
+                    </a:stretch>
+                  </pic:blipFill>
+                  <pic:spPr>
+                    <a:xfrm>
+                      <a:off x="0" y="0"/>
+                      <a:ext cx="5731510" cy="2586990"/>
+                    </a:xfrm>
+                    <a:prstGeom prst="rect">
+                      <a:avLst/>
+                    </a:prstGeom>
+                  </pic:spPr>
+                </pic:pic>
+              </a:graphicData>
+            </a:graphic>
+          </wp:inline>
+        </w:drawing>
+      </w:r>
+    </w:p>
+    <w:p>
+      <w:r>
+        <w:rPr>
+          <w:noProof/>
+        </w:rPr>
+        <w:drawing>
+          <wp:inline distT="0" distB="0" distL="0" distR="0" wp14:anchorId="068760BC" wp14:editId="421EDF39">
+            <wp:extent cx="5731510" cy="991870"/>
+            <wp:effectExtent l="0" t="0" r="2540" b="0"/>
+            <wp:docPr id="120735208" name="Picture 1" descr="The image shows a terminal interface displaying a sequence of git commands and their outputs.&#10;&#10;AI-generated content may be incorrect."/>
+            <wp:cNvGraphicFramePr>
+              <a:graphicFrameLocks xmlns:a="http://schemas.openxmlformats.org/drawingml/2006/main" noChangeAspect="1"/>
+            </wp:cNvGraphicFramePr>
+            <a:graphic xmlns:a="http://schemas.openxmlformats.org/drawingml/2006/main">
+              <a:graphicData uri="http://schemas.openxmlformats.org/drawingml/2006/picture">
+                <pic:pic xmlns:pic="http://schemas.openxmlformats.org/drawingml/2006/picture">
+                  <pic:nvPicPr>
+                    <pic:cNvPr id="120735208" name="Picture 1" descr="The image shows a terminal interface displaying a sequence of git commands and their outputs.&#10;&#10;AI-generated content may be incorrect."/>
+                    <pic:cNvPicPr/>
+                  </pic:nvPicPr>
+                  <pic:blipFill>
+                    <a:blip r:embed="rId24"/>
+                    <a:stretch>
+                      <a:fillRect/>
+                    </a:stretch>
+                  </pic:blipFill>
+                  <pic:spPr>
+                    <a:xfrm>
+                      <a:off x="0" y="0"/>
+                      <a:ext cx="5731510" cy="991870"/>
+                    </a:xfrm>
+                    <a:prstGeom prst="rect">
+                      <a:avLst/>
+                    </a:prstGeom>
+                  </pic:spPr>
+                </pic:pic>
+              </a:graphicData>
+            </a:graphic>
+          </wp:inline>
+        </w:drawing>
+      </w:r>
     </w:p>
     <w:p>
       <w:pPr>
@@ -2126,6 +2208,14 @@
       </w:r>
     </w:p>
     <w:p>
+      <w:r>
+        <w:t xml:space="preserve">Git is the version control tool that records changes. GitHub is an online platform where repositories </w:t>
+      </w:r>
+      <w:r>
+        <w:t>can be stored.</w:t>
+      </w:r>
+    </w:p>
+    <w:p>
       <w:pPr>
         <w:pStyle w:val="Heading4"/>
       </w:pPr>
@@ -2137,6 +2227,11 @@
       </w:r>
     </w:p>
     <w:p>
+      <w:r>
+        <w:t>It is a project storage area that contains code and history.</w:t>
+      </w:r>
+    </w:p>
+    <w:p>
       <w:pPr>
         <w:pStyle w:val="Heading4"/>
       </w:pPr>
@@ -2145,6 +2240,11 @@
       </w:r>
     </w:p>
     <w:p>
+      <w:r>
+        <w:t>It is a saved snapshot of changes with messages.</w:t>
+      </w:r>
+    </w:p>
+    <w:p>
       <w:pPr>
         <w:pStyle w:val="Heading4"/>
       </w:pPr>
@@ -2153,6 +2253,11 @@
       </w:r>
     </w:p>
     <w:p>
+      <w:r>
+        <w:t>So that the person can understand the purpose of the commit.</w:t>
+      </w:r>
+    </w:p>
+    <w:p>
       <w:pPr>
         <w:pStyle w:val="Heading4"/>
       </w:pPr>
@@ -2161,6 +2266,22 @@
       </w:r>
       <w:r>
         <w:t xml:space="preserve"> should teams avoid emailing code files?</w:t>
+      </w:r>
+    </w:p>
+    <w:p>
+      <w:r>
+        <w:t xml:space="preserve">As emails can cause the code getting </w:t>
+      </w:r>
+      <w:proofErr w:type="gramStart"/>
+      <w:r>
+        <w:t>editing</w:t>
+      </w:r>
+      <w:proofErr w:type="gramEnd"/>
+      <w:r>
+        <w:t xml:space="preserve"> to many times with different copies and can lose track</w:t>
+      </w:r>
+      <w:r>
+        <w:t xml:space="preserve"> of the newest version.</w:t>
       </w:r>
     </w:p>
     <w:p>
@@ -2200,7 +2321,7 @@
                     <pic:cNvPicPr/>
                   </pic:nvPicPr>
                   <pic:blipFill>
-                    <a:blip r:embed="rId23"/>
+                    <a:blip r:embed="rId25"/>
                     <a:stretch>
                       <a:fillRect/>
                     </a:stretch>
@@ -2222,6 +2343,48 @@
       </w:r>
     </w:p>
     <w:p>
+      <w:r>
+        <w:rPr>
+          <w:noProof/>
+        </w:rPr>
+        <w:drawing>
+          <wp:inline distT="0" distB="0" distL="0" distR="0" wp14:anchorId="3E72C49B" wp14:editId="450F79B5">
+            <wp:extent cx="5731510" cy="1371600"/>
+            <wp:effectExtent l="0" t="0" r="2540" b="0"/>
+            <wp:docPr id="926879274" name="Picture 1" descr="The image displays a terminal window displaying various Git commands and outputs, specifically adding and committing a file related to creating an interactive web page.&#10;&#10;AI-generated content may be incorrect."/>
+            <wp:cNvGraphicFramePr>
+              <a:graphicFrameLocks xmlns:a="http://schemas.openxmlformats.org/drawingml/2006/main" noChangeAspect="1"/>
+            </wp:cNvGraphicFramePr>
+            <a:graphic xmlns:a="http://schemas.openxmlformats.org/drawingml/2006/main">
+              <a:graphicData uri="http://schemas.openxmlformats.org/drawingml/2006/picture">
+                <pic:pic xmlns:pic="http://schemas.openxmlformats.org/drawingml/2006/picture">
+                  <pic:nvPicPr>
+                    <pic:cNvPr id="926879274" name="Picture 1" descr="The image displays a terminal window displaying various Git commands and outputs, specifically adding and committing a file related to creating an interactive web page.&#10;&#10;AI-generated content may be incorrect."/>
+                    <pic:cNvPicPr/>
+                  </pic:nvPicPr>
+                  <pic:blipFill>
+                    <a:blip r:embed="rId26"/>
+                    <a:stretch>
+                      <a:fillRect/>
+                    </a:stretch>
+                  </pic:blipFill>
+                  <pic:spPr>
+                    <a:xfrm>
+                      <a:off x="0" y="0"/>
+                      <a:ext cx="5731510" cy="1371600"/>
+                    </a:xfrm>
+                    <a:prstGeom prst="rect">
+                      <a:avLst/>
+                    </a:prstGeom>
+                  </pic:spPr>
+                </pic:pic>
+              </a:graphicData>
+            </a:graphic>
+          </wp:inline>
+        </w:drawing>
+      </w:r>
+    </w:p>
+    <w:p>
       <w:pPr>
         <w:pStyle w:val="Heading3"/>
       </w:pPr>
@@ -2230,6 +2393,48 @@
       </w:r>
     </w:p>
     <w:p>
+      <w:r>
+        <w:rPr>
+          <w:noProof/>
+        </w:rPr>
+        <w:drawing>
+          <wp:inline distT="0" distB="0" distL="0" distR="0" wp14:anchorId="52B6BF0D" wp14:editId="21E35ACF">
+            <wp:extent cx="5731510" cy="304165"/>
+            <wp:effectExtent l="0" t="0" r="2540" b="635"/>
+            <wp:docPr id="77223979" name="Picture 1" descr="The text appears to be a snippet of a shell command for a version control system (git), followed by a directory path and a reference to a JavaScript training course.&#10;&#10;AI-generated content may be incorrect."/>
+            <wp:cNvGraphicFramePr>
+              <a:graphicFrameLocks xmlns:a="http://schemas.openxmlformats.org/drawingml/2006/main" noChangeAspect="1"/>
+            </wp:cNvGraphicFramePr>
+            <a:graphic xmlns:a="http://schemas.openxmlformats.org/drawingml/2006/main">
+              <a:graphicData uri="http://schemas.openxmlformats.org/drawingml/2006/picture">
+                <pic:pic xmlns:pic="http://schemas.openxmlformats.org/drawingml/2006/picture">
+                  <pic:nvPicPr>
+                    <pic:cNvPr id="77223979" name="Picture 1" descr="The text appears to be a snippet of a shell command for a version control system (git), followed by a directory path and a reference to a JavaScript training course.&#10;&#10;AI-generated content may be incorrect."/>
+                    <pic:cNvPicPr/>
+                  </pic:nvPicPr>
+                  <pic:blipFill>
+                    <a:blip r:embed="rId27"/>
+                    <a:stretch>
+                      <a:fillRect/>
+                    </a:stretch>
+                  </pic:blipFill>
+                  <pic:spPr>
+                    <a:xfrm>
+                      <a:off x="0" y="0"/>
+                      <a:ext cx="5731510" cy="304165"/>
+                    </a:xfrm>
+                    <a:prstGeom prst="rect">
+                      <a:avLst/>
+                    </a:prstGeom>
+                  </pic:spPr>
+                </pic:pic>
+              </a:graphicData>
+            </a:graphic>
+          </wp:inline>
+        </w:drawing>
+      </w:r>
+    </w:p>
+    <w:p>
       <w:pPr>
         <w:pStyle w:val="Heading3"/>
       </w:pPr>
@@ -2238,6 +2443,90 @@
       </w:r>
     </w:p>
     <w:p>
+      <w:r>
+        <w:rPr>
+          <w:noProof/>
+        </w:rPr>
+        <w:drawing>
+          <wp:inline distT="0" distB="0" distL="0" distR="0" wp14:anchorId="603545BC" wp14:editId="7F132019">
+            <wp:extent cx="5731510" cy="1297940"/>
+            <wp:effectExtent l="0" t="0" r="2540" b="0"/>
+            <wp:docPr id="1270311054" name="Picture 1" descr="The image shows a JavaScript code snippet that includes an event listener for a click event on a welcome button, which triggers an alert message indicating a Git branch update and then logs messages to the console confirming the successful execution of the script.&#10;&#10;AI-generated content may be incorrect."/>
+            <wp:cNvGraphicFramePr>
+              <a:graphicFrameLocks xmlns:a="http://schemas.openxmlformats.org/drawingml/2006/main" noChangeAspect="1"/>
+            </wp:cNvGraphicFramePr>
+            <a:graphic xmlns:a="http://schemas.openxmlformats.org/drawingml/2006/main">
+              <a:graphicData uri="http://schemas.openxmlformats.org/drawingml/2006/picture">
+                <pic:pic xmlns:pic="http://schemas.openxmlformats.org/drawingml/2006/picture">
+                  <pic:nvPicPr>
+                    <pic:cNvPr id="1270311054" name="Picture 1" descr="The image shows a JavaScript code snippet that includes an event listener for a click event on a welcome button, which triggers an alert message indicating a Git branch update and then logs messages to the console confirming the successful execution of the script.&#10;&#10;AI-generated content may be incorrect."/>
+                    <pic:cNvPicPr/>
+                  </pic:nvPicPr>
+                  <pic:blipFill>
+                    <a:blip r:embed="rId28"/>
+                    <a:stretch>
+                      <a:fillRect/>
+                    </a:stretch>
+                  </pic:blipFill>
+                  <pic:spPr>
+                    <a:xfrm>
+                      <a:off x="0" y="0"/>
+                      <a:ext cx="5731510" cy="1297940"/>
+                    </a:xfrm>
+                    <a:prstGeom prst="rect">
+                      <a:avLst/>
+                    </a:prstGeom>
+                  </pic:spPr>
+                </pic:pic>
+              </a:graphicData>
+            </a:graphic>
+          </wp:inline>
+        </w:drawing>
+      </w:r>
+    </w:p>
+    <w:p>
+      <w:r>
+        <w:rPr>
+          <w:noProof/>
+        </w:rPr>
+        <w:drawing>
+          <wp:inline distT="0" distB="0" distL="0" distR="0" wp14:anchorId="2F43931D" wp14:editId="54627E9C">
+            <wp:extent cx="5731510" cy="1967230"/>
+            <wp:effectExtent l="0" t="0" r="2540" b="0"/>
+            <wp:docPr id="806639171" name="Picture 1" descr="The image shows a text file display on a computer screen, specifically a Git status screen showing uncommitted changes to a JavaScript file, followed by a commit message.&#10;&#10;AI-generated content may be incorrect."/>
+            <wp:cNvGraphicFramePr>
+              <a:graphicFrameLocks xmlns:a="http://schemas.openxmlformats.org/drawingml/2006/main" noChangeAspect="1"/>
+            </wp:cNvGraphicFramePr>
+            <a:graphic xmlns:a="http://schemas.openxmlformats.org/drawingml/2006/main">
+              <a:graphicData uri="http://schemas.openxmlformats.org/drawingml/2006/picture">
+                <pic:pic xmlns:pic="http://schemas.openxmlformats.org/drawingml/2006/picture">
+                  <pic:nvPicPr>
+                    <pic:cNvPr id="806639171" name="Picture 1" descr="The image shows a text file display on a computer screen, specifically a Git status screen showing uncommitted changes to a JavaScript file, followed by a commit message.&#10;&#10;AI-generated content may be incorrect."/>
+                    <pic:cNvPicPr/>
+                  </pic:nvPicPr>
+                  <pic:blipFill>
+                    <a:blip r:embed="rId29"/>
+                    <a:stretch>
+                      <a:fillRect/>
+                    </a:stretch>
+                  </pic:blipFill>
+                  <pic:spPr>
+                    <a:xfrm>
+                      <a:off x="0" y="0"/>
+                      <a:ext cx="5731510" cy="1967230"/>
+                    </a:xfrm>
+                    <a:prstGeom prst="rect">
+                      <a:avLst/>
+                    </a:prstGeom>
+                  </pic:spPr>
+                </pic:pic>
+              </a:graphicData>
+            </a:graphic>
+          </wp:inline>
+        </w:drawing>
+      </w:r>
+    </w:p>
+    <w:p>
       <w:pPr>
         <w:pStyle w:val="Heading3"/>
       </w:pPr>
@@ -2246,6 +2535,90 @@
       </w:r>
     </w:p>
     <w:p>
+      <w:r>
+        <w:rPr>
+          <w:noProof/>
+        </w:rPr>
+        <w:drawing>
+          <wp:inline distT="0" distB="0" distL="0" distR="0" wp14:anchorId="28F56347" wp14:editId="66D0355A">
+            <wp:extent cx="5731510" cy="306070"/>
+            <wp:effectExtent l="0" t="0" r="2540" b="0"/>
+            <wp:docPr id="24690929" name="Picture 1" descr="Red Academy&#10;&#10;AI-generated content may be incorrect."/>
+            <wp:cNvGraphicFramePr>
+              <a:graphicFrameLocks xmlns:a="http://schemas.openxmlformats.org/drawingml/2006/main" noChangeAspect="1"/>
+            </wp:cNvGraphicFramePr>
+            <a:graphic xmlns:a="http://schemas.openxmlformats.org/drawingml/2006/main">
+              <a:graphicData uri="http://schemas.openxmlformats.org/drawingml/2006/picture">
+                <pic:pic xmlns:pic="http://schemas.openxmlformats.org/drawingml/2006/picture">
+                  <pic:nvPicPr>
+                    <pic:cNvPr id="24690929" name="Picture 1" descr="Red Academy&#10;&#10;AI-generated content may be incorrect."/>
+                    <pic:cNvPicPr/>
+                  </pic:nvPicPr>
+                  <pic:blipFill>
+                    <a:blip r:embed="rId30"/>
+                    <a:stretch>
+                      <a:fillRect/>
+                    </a:stretch>
+                  </pic:blipFill>
+                  <pic:spPr>
+                    <a:xfrm>
+                      <a:off x="0" y="0"/>
+                      <a:ext cx="5731510" cy="306070"/>
+                    </a:xfrm>
+                    <a:prstGeom prst="rect">
+                      <a:avLst/>
+                    </a:prstGeom>
+                  </pic:spPr>
+                </pic:pic>
+              </a:graphicData>
+            </a:graphic>
+          </wp:inline>
+        </w:drawing>
+      </w:r>
+    </w:p>
+    <w:p>
+      <w:r>
+        <w:rPr>
+          <w:noProof/>
+        </w:rPr>
+        <w:drawing>
+          <wp:inline distT="0" distB="0" distL="0" distR="0" wp14:anchorId="268E5819" wp14:editId="193B3CA3">
+            <wp:extent cx="5731510" cy="1598930"/>
+            <wp:effectExtent l="0" t="0" r="2540" b="1270"/>
+            <wp:docPr id="1536944942" name="Picture 1" descr="The image displays a terminal session with git commands executing a pull request, including status updates on object enumeration, compression, and branch tracking.&#10;&#10;AI-generated content may be incorrect."/>
+            <wp:cNvGraphicFramePr>
+              <a:graphicFrameLocks xmlns:a="http://schemas.openxmlformats.org/drawingml/2006/main" noChangeAspect="1"/>
+            </wp:cNvGraphicFramePr>
+            <a:graphic xmlns:a="http://schemas.openxmlformats.org/drawingml/2006/main">
+              <a:graphicData uri="http://schemas.openxmlformats.org/drawingml/2006/picture">
+                <pic:pic xmlns:pic="http://schemas.openxmlformats.org/drawingml/2006/picture">
+                  <pic:nvPicPr>
+                    <pic:cNvPr id="1536944942" name="Picture 1" descr="The image displays a terminal session with git commands executing a pull request, including status updates on object enumeration, compression, and branch tracking.&#10;&#10;AI-generated content may be incorrect."/>
+                    <pic:cNvPicPr/>
+                  </pic:nvPicPr>
+                  <pic:blipFill>
+                    <a:blip r:embed="rId31"/>
+                    <a:stretch>
+                      <a:fillRect/>
+                    </a:stretch>
+                  </pic:blipFill>
+                  <pic:spPr>
+                    <a:xfrm>
+                      <a:off x="0" y="0"/>
+                      <a:ext cx="5731510" cy="1598930"/>
+                    </a:xfrm>
+                    <a:prstGeom prst="rect">
+                      <a:avLst/>
+                    </a:prstGeom>
+                  </pic:spPr>
+                </pic:pic>
+              </a:graphicData>
+            </a:graphic>
+          </wp:inline>
+        </w:drawing>
+      </w:r>
+    </w:p>
+    <w:p>
       <w:pPr>
         <w:pStyle w:val="Heading3"/>
       </w:pPr>
@@ -2262,6 +2635,14 @@
       </w:r>
     </w:p>
     <w:p>
+      <w:r>
+        <w:t xml:space="preserve">A branch lets the learner make a </w:t>
+      </w:r>
+      <w:r>
+        <w:t>change without immediately changing the main version.</w:t>
+      </w:r>
+    </w:p>
+    <w:p>
       <w:pPr>
         <w:pStyle w:val="Heading4"/>
       </w:pPr>
@@ -2270,6 +2651,17 @@
       </w:r>
     </w:p>
     <w:p>
+      <w:r>
+        <w:t xml:space="preserve">It sends </w:t>
+      </w:r>
+      <w:r>
+        <w:t>local commits to GitHub</w:t>
+      </w:r>
+      <w:r>
+        <w:t>.</w:t>
+      </w:r>
+    </w:p>
+    <w:p>
       <w:pPr>
         <w:pStyle w:val="Heading4"/>
       </w:pPr>
@@ -2278,6 +2670,11 @@
       </w:r>
     </w:p>
     <w:p>
+      <w:r>
+        <w:t>It’s a request for others to review and merge changes.</w:t>
+      </w:r>
+    </w:p>
+    <w:p>
       <w:pPr>
         <w:pStyle w:val="Heading4"/>
       </w:pPr>
@@ -2286,6 +2683,24 @@
       </w:r>
     </w:p>
     <w:p>
+      <w:r>
+        <w:t xml:space="preserve">A pull request should include a </w:t>
+      </w:r>
+      <w:r>
+        <w:rPr>
+          <w:b/>
+          <w:bCs/>
+        </w:rPr>
+        <w:t>short description</w:t>
+      </w:r>
+      <w:r>
+        <w:t xml:space="preserve"> because it helps reviewers quickly understand</w:t>
+      </w:r>
+      <w:r>
+        <w:t>.</w:t>
+      </w:r>
+    </w:p>
+    <w:p>
       <w:pPr>
         <w:pStyle w:val="Heading4"/>
       </w:pPr>
@@ -2293,7 +2708,11 @@
         <w:t>What evidence should prove that the change was tested?</w:t>
       </w:r>
     </w:p>
-    <w:p/>
+    <w:p>
+      <w:r>
+        <w:t>Screenshots should be showing to show that the changes were tested successfully.</w:t>
+      </w:r>
+    </w:p>
     <w:sectPr>
       <w:pgSz w:w="11906" w:h="16838"/>
       <w:pgMar w:top="1440" w:right="1440" w:bottom="1440" w:left="1440" w:header="708" w:footer="708" w:gutter="0"/>
@@ -2904,7 +3323,6 @@
   <w:style w:type="character" w:default="1" w:styleId="DefaultParagraphFont">
     <w:name w:val="Default Paragraph Font"/>
     <w:uiPriority w:val="1"/>
-    <w:semiHidden/>
     <w:unhideWhenUsed/>
   </w:style>
   <w:style w:type="table" w:default="1" w:styleId="TableNormal">

</xml_diff>